<commit_message>
bit more in stability section
</commit_message>
<xml_diff>
--- a/assignment4/report.docx
+++ b/assignment4/report.docx
@@ -28,22 +28,18 @@
     </w:p>
     <w:p>
       <w:pPr>
+        <w:pStyle w:val="Heading4"/>
+      </w:pPr>
+      <w:r>
+        <w:t>Installation method and Infer version</w:t>
+      </w:r>
+    </w:p>
+    <w:p>
+      <w:pPr>
         <w:pStyle w:val="ListParagraph"/>
         <w:numPr>
           <w:ilvl w:val="0"/>
-          <w:numId w:val="4"/>
-        </w:numPr>
-      </w:pPr>
-      <w:r>
-        <w:t>Installation method and Infer version</w:t>
-      </w:r>
-    </w:p>
-    <w:p>
-      <w:pPr>
-        <w:pStyle w:val="ListParagraph"/>
-        <w:numPr>
-          <w:ilvl w:val="1"/>
-          <w:numId w:val="2"/>
+          <w:numId w:val="22"/>
         </w:numPr>
       </w:pPr>
       <w:r>
@@ -62,12 +58,20 @@
       <w:pPr>
         <w:pStyle w:val="ListParagraph"/>
         <w:numPr>
-          <w:ilvl w:val="1"/>
-          <w:numId w:val="2"/>
+          <w:ilvl w:val="0"/>
+          <w:numId w:val="22"/>
         </w:numPr>
       </w:pPr>
       <w:r>
         <w:t>Version 1.2.0</w:t>
+      </w:r>
+    </w:p>
+    <w:p>
+      <w:pPr>
+        <w:pStyle w:val="Heading4"/>
+      </w:pPr>
+      <w:r>
+        <w:t>Operating system</w:t>
       </w:r>
     </w:p>
     <w:p>
@@ -75,23 +79,22 @@
         <w:pStyle w:val="ListParagraph"/>
         <w:numPr>
           <w:ilvl w:val="0"/>
-          <w:numId w:val="2"/>
+          <w:numId w:val="23"/>
         </w:numPr>
       </w:pPr>
       <w:r>
-        <w:t>Operating system</w:t>
-      </w:r>
-    </w:p>
-    <w:p>
-      <w:pPr>
-        <w:pStyle w:val="ListParagraph"/>
-        <w:numPr>
-          <w:ilvl w:val="1"/>
-          <w:numId w:val="2"/>
-        </w:numPr>
-      </w:pPr>
-      <w:r>
         <w:t>WSL Ubuntu 22.04.5 LTS</w:t>
+      </w:r>
+      <w:r>
+        <w:t xml:space="preserve"> (For Kylen at least)</w:t>
+      </w:r>
+    </w:p>
+    <w:p>
+      <w:pPr>
+        <w:pStyle w:val="Heading4"/>
+      </w:pPr>
+      <w:r>
+        <w:t>Java version</w:t>
       </w:r>
     </w:p>
     <w:p>
@@ -99,22 +102,10 @@
         <w:pStyle w:val="ListParagraph"/>
         <w:numPr>
           <w:ilvl w:val="0"/>
-          <w:numId w:val="2"/>
+          <w:numId w:val="23"/>
         </w:numPr>
       </w:pPr>
       <w:r>
-        <w:t>Java version</w:t>
-      </w:r>
-    </w:p>
-    <w:p>
-      <w:pPr>
-        <w:pStyle w:val="ListParagraph"/>
-        <w:numPr>
-          <w:ilvl w:val="1"/>
-          <w:numId w:val="2"/>
-        </w:numPr>
-      </w:pPr>
-      <w:r>
         <w:t>java/</w:t>
       </w:r>
       <w:proofErr w:type="spellStart"/>
@@ -127,6 +118,31 @@
       </w:r>
       <w:r>
         <w:t>21.0.10</w:t>
+      </w:r>
+    </w:p>
+    <w:p>
+      <w:r>
+        <w:rPr>
+          <w:rStyle w:val="Heading4Char"/>
+        </w:rPr>
+        <w:t>Build tool and version</w:t>
+      </w:r>
+      <w:r>
+        <w:t>: M</w:t>
+      </w:r>
+      <w:r>
+        <w:t xml:space="preserve">aven </w:t>
+      </w:r>
+      <w:r>
+        <w:t>xxx</w:t>
+      </w:r>
+    </w:p>
+    <w:p>
+      <w:pPr>
+        <w:pStyle w:val="Heading4"/>
+      </w:pPr>
+      <w:r>
+        <w:t>Repository URL and commit/tag used</w:t>
       </w:r>
     </w:p>
     <w:p>
@@ -134,53 +150,7 @@
         <w:pStyle w:val="ListParagraph"/>
         <w:numPr>
           <w:ilvl w:val="0"/>
-          <w:numId w:val="2"/>
-        </w:numPr>
-      </w:pPr>
-      <w:r>
-        <w:t>Build tool and version (</w:t>
-      </w:r>
-      <w:r>
-        <w:rPr>
-          <w:b/>
-          <w:bCs/>
-        </w:rPr>
-        <w:t>Maven</w:t>
-      </w:r>
-      <w:r>
-        <w:t xml:space="preserve"> or Gradle, as applicable)</w:t>
-      </w:r>
-    </w:p>
-    <w:p>
-      <w:pPr>
-        <w:pStyle w:val="ListParagraph"/>
-        <w:numPr>
-          <w:ilvl w:val="1"/>
-          <w:numId w:val="2"/>
-        </w:numPr>
-      </w:pPr>
-      <w:r>
-        <w:t>Maven (version? It’s a wrapper)</w:t>
-      </w:r>
-    </w:p>
-    <w:p>
-      <w:pPr>
-        <w:pStyle w:val="ListParagraph"/>
-        <w:numPr>
-          <w:ilvl w:val="0"/>
-          <w:numId w:val="2"/>
-        </w:numPr>
-      </w:pPr>
-      <w:r>
-        <w:t>Repository URL and commit/tag used</w:t>
-      </w:r>
-    </w:p>
-    <w:p>
-      <w:pPr>
-        <w:pStyle w:val="ListParagraph"/>
-        <w:numPr>
-          <w:ilvl w:val="1"/>
-          <w:numId w:val="2"/>
+          <w:numId w:val="23"/>
         </w:numPr>
       </w:pPr>
       <w:hyperlink r:id="rId6" w:history="1">
@@ -194,25 +164,15 @@
       </w:hyperlink>
     </w:p>
     <w:p>
-      <w:pPr>
-        <w:pStyle w:val="ListParagraph"/>
-        <w:numPr>
-          <w:ilvl w:val="0"/>
-          <w:numId w:val="2"/>
-        </w:numPr>
-      </w:pPr>
-      <w:r>
+      <w:r>
+        <w:rPr>
+          <w:rStyle w:val="Heading4Char"/>
+        </w:rPr>
         <w:t>Total lines of code in the repository</w:t>
       </w:r>
-    </w:p>
-    <w:p>
-      <w:pPr>
-        <w:pStyle w:val="ListParagraph"/>
-        <w:numPr>
-          <w:ilvl w:val="1"/>
-          <w:numId w:val="2"/>
-        </w:numPr>
-      </w:pPr>
+      <w:r>
+        <w:t xml:space="preserve">: </w:t>
+      </w:r>
       <w:r>
         <w:t>127</w:t>
       </w:r>
@@ -234,22 +194,18 @@
     </w:p>
     <w:p>
       <w:pPr>
+        <w:pStyle w:val="Heading4"/>
+      </w:pPr>
+      <w:r>
+        <w:t>Setup challenges encountered and how they were resolved</w:t>
+      </w:r>
+    </w:p>
+    <w:p>
+      <w:pPr>
         <w:pStyle w:val="ListParagraph"/>
         <w:numPr>
           <w:ilvl w:val="0"/>
-          <w:numId w:val="2"/>
-        </w:numPr>
-      </w:pPr>
-      <w:r>
-        <w:t>Setup challenges encountered and how they were resolved</w:t>
-      </w:r>
-    </w:p>
-    <w:p>
-      <w:pPr>
-        <w:pStyle w:val="ListParagraph"/>
-        <w:numPr>
-          <w:ilvl w:val="1"/>
-          <w:numId w:val="2"/>
+          <w:numId w:val="23"/>
         </w:numPr>
       </w:pPr>
       <w:r>
@@ -271,26 +227,21 @@
         </w:numPr>
       </w:pPr>
       <w:r>
+        <w:t xml:space="preserve"> </w:t>
+      </w:r>
+      <w:r>
         <w:t>Experiment 2: Infer Analysis and Metrics</w:t>
       </w:r>
     </w:p>
     <w:p>
       <w:pPr>
-        <w:rPr>
-          <w:b/>
-          <w:bCs/>
-          <w:i/>
-          <w:iCs/>
-        </w:rPr>
-      </w:pPr>
-      <w:r>
-        <w:rPr>
-          <w:b/>
-          <w:bCs/>
-          <w:i/>
-          <w:iCs/>
-        </w:rPr>
-        <w:t>Run Infer using the command provided for your assigned repository.</w:t>
+        <w:pStyle w:val="Heading2"/>
+      </w:pPr>
+      <w:r>
+        <w:t>Run</w:t>
+      </w:r>
+      <w:r>
+        <w:t>ning Infer</w:t>
       </w:r>
     </w:p>
     <w:p>
@@ -341,50 +292,33 @@
       <w:r>
         <w:t xml:space="preserve">” </w:t>
       </w:r>
+      <w:r>
+        <w:t>and similar commands,</w:t>
+      </w:r>
+      <w:r>
+        <w:t xml:space="preserve"> all without success</w:t>
+      </w:r>
+      <w:r>
+        <w:t xml:space="preserve">. </w:t>
+      </w:r>
+    </w:p>
+    <w:p>
+      <w:r>
+        <w:t xml:space="preserve">Note that </w:t>
+      </w:r>
       <w:proofErr w:type="spellStart"/>
       <w:r>
-        <w:t>et</w:t>
-      </w:r>
-      <w:r>
-        <w:t>c</w:t>
+        <w:t>vavr</w:t>
       </w:r>
       <w:proofErr w:type="spellEnd"/>
       <w:r>
-        <w:t xml:space="preserve"> all without success</w:t>
-      </w:r>
-      <w:r>
-        <w:t xml:space="preserve">. </w:t>
-      </w:r>
-    </w:p>
-    <w:p>
-      <w:r>
-        <w:t xml:space="preserve">Note that </w:t>
-      </w:r>
-      <w:proofErr w:type="spellStart"/>
-      <w:r>
-        <w:t>vavr</w:t>
-      </w:r>
-      <w:proofErr w:type="spellEnd"/>
-      <w:r>
         <w:t xml:space="preserve"> </w:t>
       </w:r>
       <w:r>
         <w:t>compiled</w:t>
       </w:r>
       <w:r>
-        <w:t xml:space="preserve"> fine without infer, so infer was injecting version 11 of java without being asked. Command</w:t>
-      </w:r>
-      <w:r>
-        <w:t xml:space="preserve"> arguments</w:t>
-      </w:r>
-      <w:r>
-        <w:t xml:space="preserve"> and likely reasoning </w:t>
-      </w:r>
-      <w:r>
-        <w:t xml:space="preserve">were with the help of </w:t>
-      </w:r>
-      <w:r>
-        <w:t>ChatGPT.</w:t>
+        <w:t xml:space="preserve"> fine without infer, so infer was injecting version 11 of java without being asked. </w:t>
       </w:r>
     </w:p>
     <w:p>
@@ -437,13 +371,11 @@
       </w:r>
       <w:proofErr w:type="spellEnd"/>
       <w:r>
-        <w:t xml:space="preserve">/ </w:t>
-      </w:r>
-      <w:proofErr w:type="spellStart"/>
-      <w:r>
-        <w:t>dir</w:t>
-      </w:r>
-      <w:proofErr w:type="spellEnd"/>
+        <w:t>/ dir</w:t>
+      </w:r>
+      <w:r>
+        <w:t>ectory</w:t>
+      </w:r>
       <w:r>
         <w:t xml:space="preserve"> with the contents:</w:t>
       </w:r>
@@ -522,6 +454,7 @@
     </w:p>
     <w:p>
       <w:r>
+        <w:lastRenderedPageBreak/>
         <w:t>Found</w:t>
       </w:r>
       <w:r>
@@ -543,7 +476,6 @@
         <w:rPr>
           <w:rFonts w:ascii="Consolas" w:hAnsi="Consolas"/>
         </w:rPr>
-        <w:lastRenderedPageBreak/>
         <w:t xml:space="preserve">find </w:t>
       </w:r>
       <w:proofErr w:type="spellStart"/>
@@ -591,30 +523,18 @@
     </w:p>
     <w:p>
       <w:pPr>
-        <w:rPr>
-          <w:b/>
-          <w:bCs/>
-          <w:i/>
-          <w:iCs/>
-        </w:rPr>
-      </w:pPr>
-      <w:r>
-        <w:rPr>
-          <w:b/>
-          <w:bCs/>
-          <w:i/>
-          <w:iCs/>
-        </w:rPr>
+        <w:pStyle w:val="Heading2"/>
+      </w:pPr>
+      <w:r>
         <w:t>Important metrics</w:t>
       </w:r>
-      <w:r>
-        <w:rPr>
-          <w:b/>
-          <w:bCs/>
-          <w:i/>
-          <w:iCs/>
-        </w:rPr>
-        <w:t>:</w:t>
+    </w:p>
+    <w:p>
+      <w:pPr>
+        <w:pStyle w:val="Heading4"/>
+      </w:pPr>
+      <w:r>
+        <w:t>Total issues detected</w:t>
       </w:r>
     </w:p>
     <w:p>
@@ -622,23 +542,19 @@
         <w:pStyle w:val="ListParagraph"/>
         <w:numPr>
           <w:ilvl w:val="0"/>
-          <w:numId w:val="11"/>
+          <w:numId w:val="23"/>
         </w:numPr>
       </w:pPr>
       <w:r>
-        <w:t>Total issues detected</w:t>
-      </w:r>
-    </w:p>
-    <w:p>
-      <w:pPr>
-        <w:pStyle w:val="ListParagraph"/>
-        <w:numPr>
-          <w:ilvl w:val="1"/>
-          <w:numId w:val="11"/>
-        </w:numPr>
-      </w:pPr>
-      <w:r>
         <w:t>Issues detected: 2</w:t>
+      </w:r>
+    </w:p>
+    <w:p>
+      <w:pPr>
+        <w:pStyle w:val="Heading4"/>
+      </w:pPr>
+      <w:r>
+        <w:t>Issue counts by category</w:t>
       </w:r>
     </w:p>
     <w:p>
@@ -646,26 +562,22 @@
         <w:pStyle w:val="ListParagraph"/>
         <w:numPr>
           <w:ilvl w:val="0"/>
-          <w:numId w:val="11"/>
+          <w:numId w:val="23"/>
         </w:numPr>
       </w:pPr>
       <w:r>
-        <w:t>Issue counts by category</w:t>
-      </w:r>
-    </w:p>
-    <w:p>
-      <w:pPr>
-        <w:pStyle w:val="ListParagraph"/>
-        <w:numPr>
-          <w:ilvl w:val="1"/>
-          <w:numId w:val="11"/>
-        </w:numPr>
-      </w:pPr>
-      <w:r>
         <w:t>THREAD_SAFETY_VIOLATION</w:t>
       </w:r>
       <w:r>
         <w:t>: 2</w:t>
+      </w:r>
+    </w:p>
+    <w:p>
+      <w:pPr>
+        <w:pStyle w:val="Heading4"/>
+      </w:pPr>
+      <w:r>
+        <w:t>Analysis runtime (wall clock)</w:t>
       </w:r>
     </w:p>
     <w:p>
@@ -673,23 +585,19 @@
         <w:pStyle w:val="ListParagraph"/>
         <w:numPr>
           <w:ilvl w:val="0"/>
-          <w:numId w:val="11"/>
+          <w:numId w:val="23"/>
         </w:numPr>
       </w:pPr>
       <w:r>
-        <w:t>Analysis runtime (wall clock)</w:t>
-      </w:r>
-    </w:p>
-    <w:p>
-      <w:pPr>
-        <w:pStyle w:val="ListParagraph"/>
-        <w:numPr>
-          <w:ilvl w:val="1"/>
-          <w:numId w:val="11"/>
-        </w:numPr>
-      </w:pPr>
-      <w:r>
         <w:t>55.7s</w:t>
+      </w:r>
+    </w:p>
+    <w:p>
+      <w:pPr>
+        <w:pStyle w:val="Heading4"/>
+      </w:pPr>
+      <w:r>
+        <w:t>Any build warnings or errors that affected the analysis</w:t>
       </w:r>
     </w:p>
     <w:p>
@@ -697,42 +605,19 @@
         <w:pStyle w:val="ListParagraph"/>
         <w:numPr>
           <w:ilvl w:val="0"/>
-          <w:numId w:val="11"/>
+          <w:numId w:val="23"/>
         </w:numPr>
       </w:pPr>
       <w:r>
-        <w:t>Any build warnings or errors that affected the analysis</w:t>
-      </w:r>
-    </w:p>
-    <w:p>
-      <w:pPr>
-        <w:pStyle w:val="ListParagraph"/>
-        <w:numPr>
-          <w:ilvl w:val="1"/>
-          <w:numId w:val="11"/>
-        </w:numPr>
-      </w:pPr>
-      <w:r>
         <w:t>Summarized above</w:t>
       </w:r>
     </w:p>
     <w:p>
       <w:pPr>
-        <w:rPr>
-          <w:b/>
-          <w:bCs/>
-          <w:i/>
-          <w:iCs/>
-        </w:rPr>
-      </w:pPr>
-      <w:r>
-        <w:rPr>
-          <w:b/>
-          <w:bCs/>
-          <w:i/>
-          <w:iCs/>
-        </w:rPr>
-        <w:t>Summary table:</w:t>
+        <w:pStyle w:val="Heading2"/>
+      </w:pPr>
+      <w:r>
+        <w:t>Summary table</w:t>
       </w:r>
     </w:p>
     <w:tbl>
@@ -863,10 +748,7 @@
           </w:tcPr>
           <w:p>
             <w:r>
-              <w:t>THREAD_SAFETY_VIOLATION</w:t>
-            </w:r>
-            <w:r>
-              <w:t xml:space="preserve"> </w:t>
+              <w:t xml:space="preserve">THREAD_SAFETY_VIOLATION </w:t>
             </w:r>
             <w:r>
               <w:t>(2)</w:t>
@@ -896,6 +778,17 @@
     </w:tbl>
     <w:p/>
     <w:p>
+      <w:r>
+        <w:t xml:space="preserve">Command </w:t>
+      </w:r>
+      <w:r>
+        <w:t xml:space="preserve">troubleshooting </w:t>
+      </w:r>
+      <w:r>
+        <w:t>arguments, line count command, and likely reasoning were with the help of ChatGPT.</w:t>
+      </w:r>
+    </w:p>
+    <w:p>
       <w:pPr>
         <w:pStyle w:val="Heading1"/>
         <w:numPr>
@@ -911,43 +804,19 @@
       </w:r>
     </w:p>
     <w:p>
-      <w:r>
-        <w:rPr>
-          <w:highlight w:val="yellow"/>
-        </w:rPr>
-        <w:t>Probably should</w:t>
-      </w:r>
-      <w:r>
-        <w:rPr>
-          <w:highlight w:val="yellow"/>
-        </w:rPr>
-        <w:t xml:space="preserve"> </w:t>
-      </w:r>
-      <w:r>
-        <w:rPr>
-          <w:highlight w:val="yellow"/>
-        </w:rPr>
-        <w:t>verify</w:t>
-      </w:r>
-      <w:r>
-        <w:rPr>
-          <w:highlight w:val="yellow"/>
-        </w:rPr>
-        <w:t xml:space="preserve"> we get</w:t>
-      </w:r>
-      <w:r>
-        <w:rPr>
-          <w:highlight w:val="yellow"/>
-        </w:rPr>
-        <w:t xml:space="preserve"> same results before doing this</w:t>
-      </w:r>
-    </w:p>
-    <w:p>
       <w:pPr>
         <w:pStyle w:val="Heading2"/>
       </w:pPr>
       <w:r>
         <w:t>Issue A: one issue from the most frequent issue category</w:t>
+      </w:r>
+    </w:p>
+    <w:p>
+      <w:pPr>
+        <w:pStyle w:val="Heading4"/>
+      </w:pPr>
+      <w:r>
+        <w:t>Issue type and name as reported by Infer</w:t>
       </w:r>
     </w:p>
     <w:p>
@@ -955,11 +824,28 @@
         <w:pStyle w:val="ListParagraph"/>
         <w:numPr>
           <w:ilvl w:val="0"/>
-          <w:numId w:val="11"/>
+          <w:numId w:val="19"/>
         </w:numPr>
       </w:pPr>
       <w:r>
-        <w:t>Issue type and name as reported by Infer</w:t>
+        <w:t>Thread Safety Violation</w:t>
+      </w:r>
+      <w:r>
+        <w:t xml:space="preserve"> (</w:t>
+      </w:r>
+      <w:r>
+        <w:t>THREAD_SAFETY_VIOLATION</w:t>
+      </w:r>
+      <w:r>
+        <w:t>)</w:t>
+      </w:r>
+    </w:p>
+    <w:p>
+      <w:pPr>
+        <w:pStyle w:val="Heading4"/>
+      </w:pPr>
+      <w:r>
+        <w:t>File and method name</w:t>
       </w:r>
     </w:p>
     <w:p>
@@ -967,49 +853,151 @@
         <w:pStyle w:val="ListParagraph"/>
         <w:numPr>
           <w:ilvl w:val="0"/>
-          <w:numId w:val="11"/>
+          <w:numId w:val="19"/>
         </w:numPr>
       </w:pPr>
-      <w:r>
-        <w:t>File and method name</w:t>
-      </w:r>
-    </w:p>
-    <w:p>
-      <w:pPr>
-        <w:pStyle w:val="ListParagraph"/>
-        <w:numPr>
-          <w:ilvl w:val="0"/>
-          <w:numId w:val="11"/>
-        </w:numPr>
-      </w:pPr>
-      <w:r>
+      <w:proofErr w:type="spellStart"/>
+      <w:r>
+        <w:t>vavr</w:t>
+      </w:r>
+      <w:proofErr w:type="spellEnd"/>
+      <w:r>
+        <w:t>/</w:t>
+      </w:r>
+      <w:proofErr w:type="spellStart"/>
+      <w:r>
+        <w:t>src</w:t>
+      </w:r>
+      <w:proofErr w:type="spellEnd"/>
+      <w:r>
+        <w:t>/main/java/io/</w:t>
+      </w:r>
+      <w:proofErr w:type="spellStart"/>
+      <w:r>
+        <w:t>vavr</w:t>
+      </w:r>
+      <w:proofErr w:type="spellEnd"/>
+      <w:r>
+        <w:t>/concurrent/FutureImpl.java:2</w:t>
+      </w:r>
+      <w:r>
+        <w:t>35</w:t>
+      </w:r>
+    </w:p>
+    <w:p>
+      <w:r>
+        <w:br w:type="page"/>
+      </w:r>
+    </w:p>
+    <w:p>
+      <w:pPr>
+        <w:pStyle w:val="Heading4"/>
+      </w:pPr>
+      <w:r>
+        <w:lastRenderedPageBreak/>
         <w:t>Relevant code snippet</w:t>
       </w:r>
     </w:p>
     <w:p>
       <w:pPr>
-        <w:pStyle w:val="ListParagraph"/>
-        <w:numPr>
-          <w:ilvl w:val="0"/>
-          <w:numId w:val="11"/>
-        </w:numPr>
+        <w:pStyle w:val="Heading4"/>
+      </w:pPr>
+      <w:r>
+        <w:rPr>
+          <w:rFonts w:ascii="Consolas" w:eastAsiaTheme="minorHAnsi" w:hAnsi="Consolas" w:cstheme="minorBidi"/>
+          <w:i w:val="0"/>
+          <w:iCs w:val="0"/>
+          <w:color w:val="auto"/>
+        </w:rPr>
+        <w:drawing>
+          <wp:inline distT="0" distB="0" distL="0" distR="0" wp14:anchorId="2B3C57E7" wp14:editId="11BE37C9">
+            <wp:extent cx="2321106" cy="734291"/>
+            <wp:effectExtent l="0" t="0" r="3175" b="8890"/>
+            <wp:docPr id="375992143" name="Picture 1"/>
+            <wp:cNvGraphicFramePr>
+              <a:graphicFrameLocks xmlns:a="http://schemas.openxmlformats.org/drawingml/2006/main" noChangeAspect="1"/>
+            </wp:cNvGraphicFramePr>
+            <a:graphic xmlns:a="http://schemas.openxmlformats.org/drawingml/2006/main">
+              <a:graphicData uri="http://schemas.openxmlformats.org/drawingml/2006/picture">
+                <pic:pic xmlns:pic="http://schemas.openxmlformats.org/drawingml/2006/picture">
+                  <pic:nvPicPr>
+                    <pic:cNvPr id="375992143" name=""/>
+                    <pic:cNvPicPr/>
+                  </pic:nvPicPr>
+                  <pic:blipFill>
+                    <a:blip r:embed="rId7"/>
+                    <a:stretch>
+                      <a:fillRect/>
+                    </a:stretch>
+                  </pic:blipFill>
+                  <pic:spPr>
+                    <a:xfrm>
+                      <a:off x="0" y="0"/>
+                      <a:ext cx="2331481" cy="737573"/>
+                    </a:xfrm>
+                    <a:prstGeom prst="rect">
+                      <a:avLst/>
+                    </a:prstGeom>
+                  </pic:spPr>
+                </pic:pic>
+              </a:graphicData>
+            </a:graphic>
+          </wp:inline>
+        </w:drawing>
+      </w:r>
+    </w:p>
+    <w:p>
+      <w:pPr>
+        <w:pStyle w:val="Heading4"/>
       </w:pPr>
       <w:r>
         <w:t>Screenshot or excerpt of the Infer trace</w:t>
       </w:r>
     </w:p>
     <w:p>
-      <w:pPr>
-        <w:rPr>
-          <w:b/>
-          <w:bCs/>
-        </w:rPr>
-      </w:pPr>
-      <w:r>
-        <w:rPr>
-          <w:b/>
-          <w:bCs/>
-        </w:rPr>
+      <w:r>
+        <w:drawing>
+          <wp:inline distT="0" distB="0" distL="0" distR="0" wp14:anchorId="115C91DA" wp14:editId="0728E678">
+            <wp:extent cx="5943600" cy="1289685"/>
+            <wp:effectExtent l="0" t="0" r="0" b="5715"/>
+            <wp:docPr id="563944669" name="Picture 1"/>
+            <wp:cNvGraphicFramePr>
+              <a:graphicFrameLocks xmlns:a="http://schemas.openxmlformats.org/drawingml/2006/main" noChangeAspect="1"/>
+            </wp:cNvGraphicFramePr>
+            <a:graphic xmlns:a="http://schemas.openxmlformats.org/drawingml/2006/main">
+              <a:graphicData uri="http://schemas.openxmlformats.org/drawingml/2006/picture">
+                <pic:pic xmlns:pic="http://schemas.openxmlformats.org/drawingml/2006/picture">
+                  <pic:nvPicPr>
+                    <pic:cNvPr id="563944669" name=""/>
+                    <pic:cNvPicPr/>
+                  </pic:nvPicPr>
+                  <pic:blipFill>
+                    <a:blip r:embed="rId8"/>
+                    <a:stretch>
+                      <a:fillRect/>
+                    </a:stretch>
+                  </pic:blipFill>
+                  <pic:spPr>
+                    <a:xfrm>
+                      <a:off x="0" y="0"/>
+                      <a:ext cx="5943600" cy="1289685"/>
+                    </a:xfrm>
+                    <a:prstGeom prst="rect">
+                      <a:avLst/>
+                    </a:prstGeom>
+                  </pic:spPr>
+                </pic:pic>
+              </a:graphicData>
+            </a:graphic>
+          </wp:inline>
+        </w:drawing>
+      </w:r>
+    </w:p>
+    <w:p>
+      <w:pPr>
+        <w:pStyle w:val="Heading4"/>
+      </w:pPr>
+      <w:r>
         <w:t>Execution Path Evidence Table</w:t>
       </w:r>
     </w:p>
@@ -1020,10 +1008,10 @@
         <w:tblLook w:val="04A0" w:firstRow="1" w:lastRow="0" w:firstColumn="1" w:lastColumn="0" w:noHBand="0" w:noVBand="1"/>
       </w:tblPr>
       <w:tblGrid>
-        <w:gridCol w:w="2424"/>
-        <w:gridCol w:w="1540"/>
-        <w:gridCol w:w="709"/>
-        <w:gridCol w:w="4677"/>
+        <w:gridCol w:w="2352"/>
+        <w:gridCol w:w="1842"/>
+        <w:gridCol w:w="707"/>
+        <w:gridCol w:w="4449"/>
       </w:tblGrid>
       <w:tr>
         <w:tc>
@@ -1123,12 +1111,9 @@
             <w:tcW w:w="1540" w:type="dxa"/>
           </w:tcPr>
           <w:p>
-            <w:pPr>
-              <w:rPr>
-                <w:b/>
-                <w:bCs/>
-              </w:rPr>
-            </w:pPr>
+            <w:r>
+              <w:t>FutureImpl.java</w:t>
+            </w:r>
           </w:p>
         </w:tc>
         <w:tc>
@@ -1136,26 +1121,16 @@
             <w:tcW w:w="709" w:type="dxa"/>
           </w:tcPr>
           <w:p>
-            <w:pPr>
-              <w:rPr>
-                <w:b/>
-                <w:bCs/>
-              </w:rPr>
-            </w:pPr>
+            <w:r>
+              <w:t>221</w:t>
+            </w:r>
           </w:p>
         </w:tc>
         <w:tc>
           <w:tcPr>
             <w:tcW w:w="4677" w:type="dxa"/>
           </w:tcPr>
-          <w:p>
-            <w:pPr>
-              <w:rPr>
-                <w:b/>
-                <w:bCs/>
-              </w:rPr>
-            </w:pPr>
-          </w:p>
+          <w:p/>
         </w:tc>
       </w:tr>
       <w:tr>
@@ -1174,12 +1149,9 @@
             <w:tcW w:w="1540" w:type="dxa"/>
           </w:tcPr>
           <w:p>
-            <w:pPr>
-              <w:rPr>
-                <w:b/>
-                <w:bCs/>
-              </w:rPr>
-            </w:pPr>
+            <w:r>
+              <w:t>FutureImpl.java</w:t>
+            </w:r>
           </w:p>
         </w:tc>
         <w:tc>
@@ -1187,26 +1159,16 @@
             <w:tcW w:w="709" w:type="dxa"/>
           </w:tcPr>
           <w:p>
-            <w:pPr>
-              <w:rPr>
-                <w:b/>
-                <w:bCs/>
-              </w:rPr>
-            </w:pPr>
+            <w:r>
+              <w:t>239</w:t>
+            </w:r>
           </w:p>
         </w:tc>
         <w:tc>
           <w:tcPr>
             <w:tcW w:w="4677" w:type="dxa"/>
           </w:tcPr>
-          <w:p>
-            <w:pPr>
-              <w:rPr>
-                <w:b/>
-                <w:bCs/>
-              </w:rPr>
-            </w:pPr>
-          </w:p>
+          <w:p/>
         </w:tc>
       </w:tr>
       <w:tr>
@@ -1225,12 +1187,9 @@
             <w:tcW w:w="1540" w:type="dxa"/>
           </w:tcPr>
           <w:p>
-            <w:pPr>
-              <w:rPr>
-                <w:b/>
-                <w:bCs/>
-              </w:rPr>
-            </w:pPr>
+            <w:r>
+              <w:t>FutureImpl.java</w:t>
+            </w:r>
           </w:p>
         </w:tc>
         <w:tc>
@@ -1238,26 +1197,16 @@
             <w:tcW w:w="709" w:type="dxa"/>
           </w:tcPr>
           <w:p>
-            <w:pPr>
-              <w:rPr>
-                <w:b/>
-                <w:bCs/>
-              </w:rPr>
-            </w:pPr>
+            <w:r>
+              <w:t>239</w:t>
+            </w:r>
           </w:p>
         </w:tc>
         <w:tc>
           <w:tcPr>
             <w:tcW w:w="4677" w:type="dxa"/>
           </w:tcPr>
-          <w:p>
-            <w:pPr>
-              <w:rPr>
-                <w:b/>
-                <w:bCs/>
-              </w:rPr>
-            </w:pPr>
-          </w:p>
+          <w:p/>
         </w:tc>
       </w:tr>
       <w:tr>
@@ -1275,40 +1224,19 @@
           <w:tcPr>
             <w:tcW w:w="1540" w:type="dxa"/>
           </w:tcPr>
-          <w:p>
-            <w:pPr>
-              <w:rPr>
-                <w:b/>
-                <w:bCs/>
-              </w:rPr>
-            </w:pPr>
-          </w:p>
+          <w:p/>
         </w:tc>
         <w:tc>
           <w:tcPr>
             <w:tcW w:w="709" w:type="dxa"/>
           </w:tcPr>
-          <w:p>
-            <w:pPr>
-              <w:rPr>
-                <w:b/>
-                <w:bCs/>
-              </w:rPr>
-            </w:pPr>
-          </w:p>
+          <w:p/>
         </w:tc>
         <w:tc>
           <w:tcPr>
             <w:tcW w:w="4677" w:type="dxa"/>
           </w:tcPr>
-          <w:p>
-            <w:pPr>
-              <w:rPr>
-                <w:b/>
-                <w:bCs/>
-              </w:rPr>
-            </w:pPr>
-          </w:p>
+          <w:p/>
         </w:tc>
       </w:tr>
     </w:tbl>
@@ -1322,17 +1250,42 @@
     </w:p>
     <w:p>
       <w:pPr>
+        <w:pStyle w:val="Heading4"/>
+      </w:pPr>
+      <w:r>
+        <w:t>T1. First Feasible Failure Point</w:t>
+      </w:r>
+    </w:p>
+    <w:p>
+      <w:pPr>
         <w:rPr>
           <w:b/>
           <w:bCs/>
         </w:rPr>
       </w:pPr>
-      <w:r>
+    </w:p>
+    <w:p>
+      <w:pPr>
+        <w:pStyle w:val="Heading4"/>
+      </w:pPr>
+      <w:r>
+        <w:t>T2. Infer Assumption</w:t>
+      </w:r>
+    </w:p>
+    <w:p>
+      <w:pPr>
         <w:rPr>
           <w:b/>
           <w:bCs/>
         </w:rPr>
-        <w:t>T1. First Feasible Failure Point</w:t>
+      </w:pPr>
+    </w:p>
+    <w:p>
+      <w:pPr>
+        <w:pStyle w:val="Heading4"/>
+      </w:pPr>
+      <w:r>
+        <w:t>T3. Refactoring Robustness</w:t>
       </w:r>
     </w:p>
     <w:p>
@@ -1345,85 +1298,21 @@
     </w:p>
     <w:p>
       <w:pPr>
-        <w:rPr>
-          <w:b/>
-          <w:bCs/>
-        </w:rPr>
-      </w:pPr>
-      <w:r>
-        <w:rPr>
-          <w:b/>
-          <w:bCs/>
-        </w:rPr>
-        <w:t>T2. Infer Assumption</w:t>
-      </w:r>
-    </w:p>
-    <w:p>
-      <w:pPr>
-        <w:rPr>
-          <w:b/>
-          <w:bCs/>
-        </w:rPr>
-      </w:pPr>
-    </w:p>
-    <w:p>
-      <w:pPr>
-        <w:rPr>
-          <w:b/>
-          <w:bCs/>
-        </w:rPr>
-      </w:pPr>
-      <w:r>
-        <w:rPr>
-          <w:b/>
-          <w:bCs/>
-        </w:rPr>
-        <w:t>T3. Refactoring Robustness</w:t>
-      </w:r>
-    </w:p>
-    <w:p>
-      <w:pPr>
-        <w:rPr>
-          <w:b/>
-          <w:bCs/>
-        </w:rPr>
-      </w:pPr>
-    </w:p>
-    <w:p>
-      <w:pPr>
-        <w:rPr>
-          <w:b/>
-          <w:bCs/>
-        </w:rPr>
-      </w:pPr>
-      <w:r>
-        <w:rPr>
-          <w:b/>
-          <w:bCs/>
-        </w:rPr>
+        <w:pStyle w:val="Heading4"/>
+      </w:pPr>
+      <w:r>
         <w:t>Classification</w:t>
       </w:r>
     </w:p>
     <w:p/>
     <w:p>
       <w:pPr>
-        <w:rPr>
-          <w:b/>
-          <w:bCs/>
-        </w:rPr>
-      </w:pPr>
-      <w:r>
-        <w:rPr>
-          <w:b/>
-          <w:bCs/>
-        </w:rPr>
+        <w:pStyle w:val="Heading4"/>
+      </w:pPr>
+      <w:r>
         <w:t>Fix Validation</w:t>
       </w:r>
       <w:r>
-        <w:rPr>
-          <w:b/>
-          <w:bCs/>
-        </w:rPr>
         <w:t xml:space="preserve"> (Issue A only)</w:t>
       </w:r>
     </w:p>
@@ -1470,6 +1359,7 @@
         </w:numPr>
       </w:pPr>
       <w:r>
+        <w:lastRenderedPageBreak/>
         <w:t>Relevant code snippet</w:t>
       </w:r>
     </w:p>
@@ -1487,16 +1377,9 @@
     </w:p>
     <w:p>
       <w:pPr>
-        <w:rPr>
-          <w:b/>
-          <w:bCs/>
-        </w:rPr>
-      </w:pPr>
-      <w:r>
-        <w:rPr>
-          <w:b/>
-          <w:bCs/>
-        </w:rPr>
+        <w:pStyle w:val="Heading4"/>
+      </w:pPr>
+      <w:r>
         <w:t>Execution Path Evidence Table</w:t>
       </w:r>
     </w:p>
@@ -1809,17 +1692,42 @@
     </w:p>
     <w:p>
       <w:pPr>
+        <w:pStyle w:val="Heading4"/>
+      </w:pPr>
+      <w:r>
+        <w:t>T1. First Feasible Failure Point</w:t>
+      </w:r>
+    </w:p>
+    <w:p>
+      <w:pPr>
         <w:rPr>
           <w:b/>
           <w:bCs/>
         </w:rPr>
       </w:pPr>
-      <w:r>
+    </w:p>
+    <w:p>
+      <w:pPr>
+        <w:pStyle w:val="Heading4"/>
+      </w:pPr>
+      <w:r>
+        <w:t>T2. Infer Assumption</w:t>
+      </w:r>
+    </w:p>
+    <w:p>
+      <w:pPr>
         <w:rPr>
           <w:b/>
           <w:bCs/>
         </w:rPr>
-        <w:t>T1. First Feasible Failure Point</w:t>
+      </w:pPr>
+    </w:p>
+    <w:p>
+      <w:pPr>
+        <w:pStyle w:val="Heading4"/>
+      </w:pPr>
+      <w:r>
+        <w:t>T3. Refactoring Robustness</w:t>
       </w:r>
     </w:p>
     <w:p>
@@ -1832,6 +1740,14 @@
     </w:p>
     <w:p>
       <w:pPr>
+        <w:pStyle w:val="Heading4"/>
+      </w:pPr>
+      <w:r>
+        <w:t>Classification</w:t>
+      </w:r>
+    </w:p>
+    <w:p>
+      <w:pPr>
         <w:rPr>
           <w:b/>
           <w:bCs/>
@@ -1842,70 +1758,8 @@
           <w:b/>
           <w:bCs/>
         </w:rPr>
-        <w:t>T2. Infer Assumption</w:t>
-      </w:r>
-    </w:p>
-    <w:p>
-      <w:pPr>
-        <w:rPr>
-          <w:b/>
-          <w:bCs/>
-        </w:rPr>
-      </w:pPr>
-    </w:p>
-    <w:p>
-      <w:pPr>
-        <w:rPr>
-          <w:b/>
-          <w:bCs/>
-        </w:rPr>
-      </w:pPr>
-      <w:r>
-        <w:rPr>
-          <w:b/>
-          <w:bCs/>
-        </w:rPr>
-        <w:t>T3. Refactoring Robustness</w:t>
-      </w:r>
-    </w:p>
-    <w:p>
-      <w:pPr>
-        <w:rPr>
-          <w:b/>
-          <w:bCs/>
-        </w:rPr>
-      </w:pPr>
-    </w:p>
-    <w:p>
-      <w:pPr>
-        <w:rPr>
-          <w:b/>
-          <w:bCs/>
-        </w:rPr>
-      </w:pPr>
-      <w:r>
-        <w:rPr>
-          <w:b/>
-          <w:bCs/>
-        </w:rPr>
-        <w:t>Classification</w:t>
-      </w:r>
-    </w:p>
-    <w:p>
-      <w:pPr>
-        <w:rPr>
-          <w:b/>
-          <w:bCs/>
-        </w:rPr>
-      </w:pPr>
-    </w:p>
-    <w:p>
-      <w:pPr>
-        <w:rPr>
-          <w:b/>
-          <w:bCs/>
-        </w:rPr>
-      </w:pPr>
+        <w:br w:type="page"/>
+      </w:r>
     </w:p>
     <w:p>
       <w:pPr>
@@ -1931,37 +1785,111 @@
       </w:r>
     </w:p>
     <w:p>
-      <w:r>
-        <w:t>Choose any one method in the repository. Apply one small semantics-preserving modification</w:t>
-      </w:r>
-      <w:r>
-        <w:t xml:space="preserve"> […]</w:t>
-      </w:r>
-    </w:p>
-    <w:p>
-      <w:r>
-        <w:t>Adjusted code as follows:</w:t>
-      </w:r>
-    </w:p>
-    <w:p/>
-    <w:p>
+      <w:pPr>
+        <w:rPr>
+          <w:rFonts w:eastAsiaTheme="majorEastAsia" w:cstheme="majorBidi"/>
+          <w:i/>
+          <w:iCs/>
+          <w:color w:val="0F4761" w:themeColor="accent1" w:themeShade="BF"/>
+        </w:rPr>
+      </w:pPr>
+      <w:r>
+        <w:rPr>
+          <w:rStyle w:val="Heading4Char"/>
+        </w:rPr>
+        <w:t>Adjusted cod</w:t>
+      </w:r>
+      <w:r>
+        <w:rPr>
+          <w:rStyle w:val="Heading4Char"/>
+        </w:rPr>
+        <w:t>e:</w:t>
+      </w:r>
+    </w:p>
+    <w:p>
+      <w:pPr>
+        <w:pStyle w:val="Heading4"/>
+      </w:pPr>
+      <w:r>
+        <w:rPr>
+          <w:rFonts w:eastAsiaTheme="minorHAnsi" w:cstheme="minorBidi"/>
+          <w:i w:val="0"/>
+          <w:iCs w:val="0"/>
+          <w:color w:val="auto"/>
+        </w:rPr>
+        <w:drawing>
+          <wp:inline distT="0" distB="0" distL="0" distR="0" wp14:anchorId="503FE4A7" wp14:editId="6B9C9189">
+            <wp:extent cx="2223655" cy="952994"/>
+            <wp:effectExtent l="0" t="0" r="5715" b="0"/>
+            <wp:docPr id="335738032" name="Picture 1"/>
+            <wp:cNvGraphicFramePr>
+              <a:graphicFrameLocks xmlns:a="http://schemas.openxmlformats.org/drawingml/2006/main" noChangeAspect="1"/>
+            </wp:cNvGraphicFramePr>
+            <a:graphic xmlns:a="http://schemas.openxmlformats.org/drawingml/2006/main">
+              <a:graphicData uri="http://schemas.openxmlformats.org/drawingml/2006/picture">
+                <pic:pic xmlns:pic="http://schemas.openxmlformats.org/drawingml/2006/picture">
+                  <pic:nvPicPr>
+                    <pic:cNvPr id="335738032" name=""/>
+                    <pic:cNvPicPr/>
+                  </pic:nvPicPr>
+                  <pic:blipFill>
+                    <a:blip r:embed="rId9"/>
+                    <a:stretch>
+                      <a:fillRect/>
+                    </a:stretch>
+                  </pic:blipFill>
+                  <pic:spPr>
+                    <a:xfrm>
+                      <a:off x="0" y="0"/>
+                      <a:ext cx="2239257" cy="959680"/>
+                    </a:xfrm>
+                    <a:prstGeom prst="rect">
+                      <a:avLst/>
+                    </a:prstGeom>
+                  </pic:spPr>
+                </pic:pic>
+              </a:graphicData>
+            </a:graphic>
+          </wp:inline>
+        </w:drawing>
+      </w:r>
+    </w:p>
+    <w:p>
+      <w:pPr>
+        <w:pStyle w:val="Heading4"/>
+      </w:pPr>
       <w:r>
         <w:t>Did the total issue count change?</w:t>
       </w:r>
-    </w:p>
-    <w:p>
+      <w:r>
+        <w:t xml:space="preserve"> </w:t>
+      </w:r>
       <w:r>
         <w:t>Did the issues you investigated in Experiment 3 move or disappear?</w:t>
       </w:r>
-    </w:p>
-    <w:p>
+      <w:r>
+        <w:t xml:space="preserve"> </w:t>
+      </w:r>
       <w:r>
         <w:t>Did any new issues appear?</w:t>
       </w:r>
     </w:p>
     <w:p>
       <w:r>
+        <w:t>The number of issues (2) did not change, the total issues and types were identical as before.</w:t>
+      </w:r>
+    </w:p>
+    <w:p>
+      <w:pPr>
+        <w:pStyle w:val="Heading4"/>
+      </w:pPr>
+      <w:r>
         <w:t>What does this suggest about the stability of path-sensitive analysis?</w:t>
+      </w:r>
+    </w:p>
+    <w:p>
+      <w:r>
+        <w:t>This suggests that path-sensitive analysis is stable when introduced to small changes such as a temporary variable and whitespace. This tells us that Infer is likely a tool with stable results even across non-functional code changes.</w:t>
       </w:r>
     </w:p>
     <w:p>
@@ -2003,20 +1931,6 @@
         <w:rPr>
           <w:highlight w:val="yellow"/>
         </w:rPr>
-        <w:t xml:space="preserve"> </w:t>
-      </w:r>
-      <w:proofErr w:type="spellStart"/>
-      <w:r>
-        <w:rPr>
-          <w:highlight w:val="yellow"/>
-        </w:rPr>
-        <w:t>semgrep</w:t>
-      </w:r>
-      <w:proofErr w:type="spellEnd"/>
-      <w:r>
-        <w:rPr>
-          <w:highlight w:val="yellow"/>
-        </w:rPr>
         <w:t xml:space="preserve"> result</w:t>
       </w:r>
       <w:r>
@@ -2028,40 +1942,17 @@
     </w:p>
     <w:p>
       <w:pPr>
-        <w:rPr>
-          <w:b/>
-          <w:bCs/>
-          <w:i/>
-          <w:iCs/>
-        </w:rPr>
-      </w:pPr>
-      <w:r>
-        <w:rPr>
-          <w:b/>
-          <w:bCs/>
-          <w:i/>
-          <w:iCs/>
-        </w:rPr>
+        <w:pStyle w:val="Heading4"/>
+      </w:pPr>
+      <w:r>
         <w:t xml:space="preserve">Run </w:t>
       </w:r>
       <w:proofErr w:type="spellStart"/>
       <w:r>
-        <w:rPr>
-          <w:b/>
-          <w:bCs/>
-          <w:i/>
-          <w:iCs/>
-        </w:rPr>
         <w:t>Semgrep</w:t>
       </w:r>
       <w:proofErr w:type="spellEnd"/>
       <w:r>
-        <w:rPr>
-          <w:b/>
-          <w:bCs/>
-          <w:i/>
-          <w:iCs/>
-        </w:rPr>
         <w:t xml:space="preserve"> on the same repository using the default Java ruleset</w:t>
       </w:r>
     </w:p>
@@ -2095,10 +1986,7 @@
         </w:numPr>
       </w:pPr>
       <w:r>
-        <w:t>Total findings</w:t>
-      </w:r>
-      <w:r>
-        <w:t>: 0</w:t>
+        <w:t>Total findings: 0</w:t>
       </w:r>
     </w:p>
     <w:p>
@@ -2110,10 +1998,7 @@
         </w:numPr>
       </w:pPr>
       <w:r>
-        <w:t>Top issue types</w:t>
-      </w:r>
-      <w:r>
-        <w:t>: N/A</w:t>
+        <w:t>Top issue types: N/A</w:t>
       </w:r>
     </w:p>
     <w:p>
@@ -2125,10 +2010,7 @@
         </w:numPr>
       </w:pPr>
       <w:r>
-        <w:t>Runtime</w:t>
-      </w:r>
-      <w:r>
-        <w:t xml:space="preserve">: </w:t>
+        <w:t xml:space="preserve">Runtime: </w:t>
       </w:r>
       <w:r>
         <w:t>3s</w:t>
@@ -2280,12 +2162,18 @@
     </w:tbl>
     <w:p/>
     <w:p>
+      <w:pPr>
+        <w:pStyle w:val="Heading4"/>
+      </w:pPr>
       <w:r>
         <w:t>Did both tools report issues in the same files or methods?</w:t>
       </w:r>
     </w:p>
     <w:p/>
     <w:p>
+      <w:pPr>
+        <w:pStyle w:val="Heading4"/>
+      </w:pPr>
       <w:r>
         <w:t xml:space="preserve">Why might </w:t>
       </w:r>
@@ -2300,7 +2188,11 @@
     </w:p>
     <w:p/>
     <w:p>
-      <w:r>
+      <w:pPr>
+        <w:pStyle w:val="Heading4"/>
+      </w:pPr>
+      <w:r>
+        <w:lastRenderedPageBreak/>
         <w:t xml:space="preserve">Why might Infer detect issues that </w:t>
       </w:r>
       <w:proofErr w:type="spellStart"/>
@@ -2314,18 +2206,11 @@
     </w:p>
     <w:p/>
     <w:p>
-      <w:r>
-        <w:lastRenderedPageBreak/>
-        <w:t>Which tool appears more useful for detecting runtime failures in your assigned repository?</w:t>
-      </w:r>
-      <w:r>
-        <w:t xml:space="preserve"> </w:t>
-      </w:r>
-      <w:r>
-        <w:t>Justify your answer</w:t>
-      </w:r>
-      <w:r>
-        <w:t>.</w:t>
+      <w:pPr>
+        <w:pStyle w:val="Heading4"/>
+      </w:pPr>
+      <w:r>
+        <w:t>Which tool appears more useful for detecting runtime failures in your assigned repository? Justify your answer.</w:t>
       </w:r>
     </w:p>
     <w:p/>
@@ -2655,6 +2540,119 @@
     </w:lvl>
   </w:abstractNum>
   <w:abstractNum w:abstractNumId="3" w15:restartNumberingAfterBreak="0">
+    <w:nsid w:val="1920037B"/>
+    <w:multiLevelType w:val="hybridMultilevel"/>
+    <w:tmpl w:val="84809738"/>
+    <w:lvl w:ilvl="0" w:tplc="10090001">
+      <w:start w:val="1"/>
+      <w:numFmt w:val="bullet"/>
+      <w:lvlText w:val=""/>
+      <w:lvlJc w:val="left"/>
+      <w:pPr>
+        <w:ind w:left="1080" w:hanging="360"/>
+      </w:pPr>
+      <w:rPr>
+        <w:rFonts w:ascii="Symbol" w:hAnsi="Symbol" w:hint="default"/>
+      </w:rPr>
+    </w:lvl>
+    <w:lvl w:ilvl="1" w:tplc="10090003" w:tentative="1">
+      <w:start w:val="1"/>
+      <w:numFmt w:val="bullet"/>
+      <w:lvlText w:val="o"/>
+      <w:lvlJc w:val="left"/>
+      <w:pPr>
+        <w:ind w:left="1800" w:hanging="360"/>
+      </w:pPr>
+      <w:rPr>
+        <w:rFonts w:ascii="Courier New" w:hAnsi="Courier New" w:cs="Courier New" w:hint="default"/>
+      </w:rPr>
+    </w:lvl>
+    <w:lvl w:ilvl="2" w:tplc="10090005" w:tentative="1">
+      <w:start w:val="1"/>
+      <w:numFmt w:val="bullet"/>
+      <w:lvlText w:val=""/>
+      <w:lvlJc w:val="left"/>
+      <w:pPr>
+        <w:ind w:left="2520" w:hanging="360"/>
+      </w:pPr>
+      <w:rPr>
+        <w:rFonts w:ascii="Wingdings" w:hAnsi="Wingdings" w:hint="default"/>
+      </w:rPr>
+    </w:lvl>
+    <w:lvl w:ilvl="3" w:tplc="10090001" w:tentative="1">
+      <w:start w:val="1"/>
+      <w:numFmt w:val="bullet"/>
+      <w:lvlText w:val=""/>
+      <w:lvlJc w:val="left"/>
+      <w:pPr>
+        <w:ind w:left="3240" w:hanging="360"/>
+      </w:pPr>
+      <w:rPr>
+        <w:rFonts w:ascii="Symbol" w:hAnsi="Symbol" w:hint="default"/>
+      </w:rPr>
+    </w:lvl>
+    <w:lvl w:ilvl="4" w:tplc="10090003" w:tentative="1">
+      <w:start w:val="1"/>
+      <w:numFmt w:val="bullet"/>
+      <w:lvlText w:val="o"/>
+      <w:lvlJc w:val="left"/>
+      <w:pPr>
+        <w:ind w:left="3960" w:hanging="360"/>
+      </w:pPr>
+      <w:rPr>
+        <w:rFonts w:ascii="Courier New" w:hAnsi="Courier New" w:cs="Courier New" w:hint="default"/>
+      </w:rPr>
+    </w:lvl>
+    <w:lvl w:ilvl="5" w:tplc="10090005" w:tentative="1">
+      <w:start w:val="1"/>
+      <w:numFmt w:val="bullet"/>
+      <w:lvlText w:val=""/>
+      <w:lvlJc w:val="left"/>
+      <w:pPr>
+        <w:ind w:left="4680" w:hanging="360"/>
+      </w:pPr>
+      <w:rPr>
+        <w:rFonts w:ascii="Wingdings" w:hAnsi="Wingdings" w:hint="default"/>
+      </w:rPr>
+    </w:lvl>
+    <w:lvl w:ilvl="6" w:tplc="10090001" w:tentative="1">
+      <w:start w:val="1"/>
+      <w:numFmt w:val="bullet"/>
+      <w:lvlText w:val=""/>
+      <w:lvlJc w:val="left"/>
+      <w:pPr>
+        <w:ind w:left="5400" w:hanging="360"/>
+      </w:pPr>
+      <w:rPr>
+        <w:rFonts w:ascii="Symbol" w:hAnsi="Symbol" w:hint="default"/>
+      </w:rPr>
+    </w:lvl>
+    <w:lvl w:ilvl="7" w:tplc="10090003" w:tentative="1">
+      <w:start w:val="1"/>
+      <w:numFmt w:val="bullet"/>
+      <w:lvlText w:val="o"/>
+      <w:lvlJc w:val="left"/>
+      <w:pPr>
+        <w:ind w:left="6120" w:hanging="360"/>
+      </w:pPr>
+      <w:rPr>
+        <w:rFonts w:ascii="Courier New" w:hAnsi="Courier New" w:cs="Courier New" w:hint="default"/>
+      </w:rPr>
+    </w:lvl>
+    <w:lvl w:ilvl="8" w:tplc="10090005" w:tentative="1">
+      <w:start w:val="1"/>
+      <w:numFmt w:val="bullet"/>
+      <w:lvlText w:val=""/>
+      <w:lvlJc w:val="left"/>
+      <w:pPr>
+        <w:ind w:left="6840" w:hanging="360"/>
+      </w:pPr>
+      <w:rPr>
+        <w:rFonts w:ascii="Wingdings" w:hAnsi="Wingdings" w:hint="default"/>
+      </w:rPr>
+    </w:lvl>
+  </w:abstractNum>
+  <w:abstractNum w:abstractNumId="4" w15:restartNumberingAfterBreak="0">
     <w:nsid w:val="1CF7773A"/>
     <w:multiLevelType w:val="hybridMultilevel"/>
     <w:tmpl w:val="B3AE86AC"/>
@@ -2766,7 +2764,7 @@
       </w:rPr>
     </w:lvl>
   </w:abstractNum>
-  <w:abstractNum w:abstractNumId="4" w15:restartNumberingAfterBreak="0">
+  <w:abstractNum w:abstractNumId="5" w15:restartNumberingAfterBreak="0">
     <w:nsid w:val="1E5D0915"/>
     <w:multiLevelType w:val="hybridMultilevel"/>
     <w:tmpl w:val="1B4235F6"/>
@@ -2878,7 +2876,7 @@
       </w:rPr>
     </w:lvl>
   </w:abstractNum>
-  <w:abstractNum w:abstractNumId="5" w15:restartNumberingAfterBreak="0">
+  <w:abstractNum w:abstractNumId="6" w15:restartNumberingAfterBreak="0">
     <w:nsid w:val="25A309D6"/>
     <w:multiLevelType w:val="hybridMultilevel"/>
     <w:tmpl w:val="2FEA74DA"/>
@@ -2991,7 +2989,120 @@
       </w:rPr>
     </w:lvl>
   </w:abstractNum>
-  <w:abstractNum w:abstractNumId="6" w15:restartNumberingAfterBreak="0">
+  <w:abstractNum w:abstractNumId="7" w15:restartNumberingAfterBreak="0">
+    <w:nsid w:val="2C380EC7"/>
+    <w:multiLevelType w:val="hybridMultilevel"/>
+    <w:tmpl w:val="3B8A8F76"/>
+    <w:lvl w:ilvl="0" w:tplc="10090001">
+      <w:start w:val="1"/>
+      <w:numFmt w:val="bullet"/>
+      <w:lvlText w:val=""/>
+      <w:lvlJc w:val="left"/>
+      <w:pPr>
+        <w:ind w:left="720" w:hanging="360"/>
+      </w:pPr>
+      <w:rPr>
+        <w:rFonts w:ascii="Symbol" w:hAnsi="Symbol" w:hint="default"/>
+      </w:rPr>
+    </w:lvl>
+    <w:lvl w:ilvl="1" w:tplc="10090003">
+      <w:start w:val="1"/>
+      <w:numFmt w:val="bullet"/>
+      <w:lvlText w:val="o"/>
+      <w:lvlJc w:val="left"/>
+      <w:pPr>
+        <w:ind w:left="1440" w:hanging="360"/>
+      </w:pPr>
+      <w:rPr>
+        <w:rFonts w:ascii="Courier New" w:hAnsi="Courier New" w:cs="Courier New" w:hint="default"/>
+      </w:rPr>
+    </w:lvl>
+    <w:lvl w:ilvl="2" w:tplc="10090005" w:tentative="1">
+      <w:start w:val="1"/>
+      <w:numFmt w:val="bullet"/>
+      <w:lvlText w:val=""/>
+      <w:lvlJc w:val="left"/>
+      <w:pPr>
+        <w:ind w:left="2160" w:hanging="360"/>
+      </w:pPr>
+      <w:rPr>
+        <w:rFonts w:ascii="Wingdings" w:hAnsi="Wingdings" w:hint="default"/>
+      </w:rPr>
+    </w:lvl>
+    <w:lvl w:ilvl="3" w:tplc="10090001" w:tentative="1">
+      <w:start w:val="1"/>
+      <w:numFmt w:val="bullet"/>
+      <w:lvlText w:val=""/>
+      <w:lvlJc w:val="left"/>
+      <w:pPr>
+        <w:ind w:left="2880" w:hanging="360"/>
+      </w:pPr>
+      <w:rPr>
+        <w:rFonts w:ascii="Symbol" w:hAnsi="Symbol" w:hint="default"/>
+      </w:rPr>
+    </w:lvl>
+    <w:lvl w:ilvl="4" w:tplc="10090003" w:tentative="1">
+      <w:start w:val="1"/>
+      <w:numFmt w:val="bullet"/>
+      <w:lvlText w:val="o"/>
+      <w:lvlJc w:val="left"/>
+      <w:pPr>
+        <w:ind w:left="3600" w:hanging="360"/>
+      </w:pPr>
+      <w:rPr>
+        <w:rFonts w:ascii="Courier New" w:hAnsi="Courier New" w:cs="Courier New" w:hint="default"/>
+      </w:rPr>
+    </w:lvl>
+    <w:lvl w:ilvl="5" w:tplc="10090005" w:tentative="1">
+      <w:start w:val="1"/>
+      <w:numFmt w:val="bullet"/>
+      <w:lvlText w:val=""/>
+      <w:lvlJc w:val="left"/>
+      <w:pPr>
+        <w:ind w:left="4320" w:hanging="360"/>
+      </w:pPr>
+      <w:rPr>
+        <w:rFonts w:ascii="Wingdings" w:hAnsi="Wingdings" w:hint="default"/>
+      </w:rPr>
+    </w:lvl>
+    <w:lvl w:ilvl="6" w:tplc="10090001" w:tentative="1">
+      <w:start w:val="1"/>
+      <w:numFmt w:val="bullet"/>
+      <w:lvlText w:val=""/>
+      <w:lvlJc w:val="left"/>
+      <w:pPr>
+        <w:ind w:left="5040" w:hanging="360"/>
+      </w:pPr>
+      <w:rPr>
+        <w:rFonts w:ascii="Symbol" w:hAnsi="Symbol" w:hint="default"/>
+      </w:rPr>
+    </w:lvl>
+    <w:lvl w:ilvl="7" w:tplc="10090003" w:tentative="1">
+      <w:start w:val="1"/>
+      <w:numFmt w:val="bullet"/>
+      <w:lvlText w:val="o"/>
+      <w:lvlJc w:val="left"/>
+      <w:pPr>
+        <w:ind w:left="5760" w:hanging="360"/>
+      </w:pPr>
+      <w:rPr>
+        <w:rFonts w:ascii="Courier New" w:hAnsi="Courier New" w:cs="Courier New" w:hint="default"/>
+      </w:rPr>
+    </w:lvl>
+    <w:lvl w:ilvl="8" w:tplc="10090005" w:tentative="1">
+      <w:start w:val="1"/>
+      <w:numFmt w:val="bullet"/>
+      <w:lvlText w:val=""/>
+      <w:lvlJc w:val="left"/>
+      <w:pPr>
+        <w:ind w:left="6480" w:hanging="360"/>
+      </w:pPr>
+      <w:rPr>
+        <w:rFonts w:ascii="Wingdings" w:hAnsi="Wingdings" w:hint="default"/>
+      </w:rPr>
+    </w:lvl>
+  </w:abstractNum>
+  <w:abstractNum w:abstractNumId="8" w15:restartNumberingAfterBreak="0">
     <w:nsid w:val="333B2A0E"/>
     <w:multiLevelType w:val="hybridMultilevel"/>
     <w:tmpl w:val="18EA18A4"/>
@@ -3103,7 +3214,120 @@
       </w:rPr>
     </w:lvl>
   </w:abstractNum>
-  <w:abstractNum w:abstractNumId="7" w15:restartNumberingAfterBreak="0">
+  <w:abstractNum w:abstractNumId="9" w15:restartNumberingAfterBreak="0">
+    <w:nsid w:val="3CD85C58"/>
+    <w:multiLevelType w:val="hybridMultilevel"/>
+    <w:tmpl w:val="7F7073DA"/>
+    <w:lvl w:ilvl="0" w:tplc="10090001">
+      <w:start w:val="1"/>
+      <w:numFmt w:val="bullet"/>
+      <w:lvlText w:val=""/>
+      <w:lvlJc w:val="left"/>
+      <w:pPr>
+        <w:ind w:left="1080" w:hanging="360"/>
+      </w:pPr>
+      <w:rPr>
+        <w:rFonts w:ascii="Symbol" w:hAnsi="Symbol" w:hint="default"/>
+      </w:rPr>
+    </w:lvl>
+    <w:lvl w:ilvl="1" w:tplc="10090003" w:tentative="1">
+      <w:start w:val="1"/>
+      <w:numFmt w:val="bullet"/>
+      <w:lvlText w:val="o"/>
+      <w:lvlJc w:val="left"/>
+      <w:pPr>
+        <w:ind w:left="1800" w:hanging="360"/>
+      </w:pPr>
+      <w:rPr>
+        <w:rFonts w:ascii="Courier New" w:hAnsi="Courier New" w:cs="Courier New" w:hint="default"/>
+      </w:rPr>
+    </w:lvl>
+    <w:lvl w:ilvl="2" w:tplc="10090005" w:tentative="1">
+      <w:start w:val="1"/>
+      <w:numFmt w:val="bullet"/>
+      <w:lvlText w:val=""/>
+      <w:lvlJc w:val="left"/>
+      <w:pPr>
+        <w:ind w:left="2520" w:hanging="360"/>
+      </w:pPr>
+      <w:rPr>
+        <w:rFonts w:ascii="Wingdings" w:hAnsi="Wingdings" w:hint="default"/>
+      </w:rPr>
+    </w:lvl>
+    <w:lvl w:ilvl="3" w:tplc="10090001" w:tentative="1">
+      <w:start w:val="1"/>
+      <w:numFmt w:val="bullet"/>
+      <w:lvlText w:val=""/>
+      <w:lvlJc w:val="left"/>
+      <w:pPr>
+        <w:ind w:left="3240" w:hanging="360"/>
+      </w:pPr>
+      <w:rPr>
+        <w:rFonts w:ascii="Symbol" w:hAnsi="Symbol" w:hint="default"/>
+      </w:rPr>
+    </w:lvl>
+    <w:lvl w:ilvl="4" w:tplc="10090003" w:tentative="1">
+      <w:start w:val="1"/>
+      <w:numFmt w:val="bullet"/>
+      <w:lvlText w:val="o"/>
+      <w:lvlJc w:val="left"/>
+      <w:pPr>
+        <w:ind w:left="3960" w:hanging="360"/>
+      </w:pPr>
+      <w:rPr>
+        <w:rFonts w:ascii="Courier New" w:hAnsi="Courier New" w:cs="Courier New" w:hint="default"/>
+      </w:rPr>
+    </w:lvl>
+    <w:lvl w:ilvl="5" w:tplc="10090005" w:tentative="1">
+      <w:start w:val="1"/>
+      <w:numFmt w:val="bullet"/>
+      <w:lvlText w:val=""/>
+      <w:lvlJc w:val="left"/>
+      <w:pPr>
+        <w:ind w:left="4680" w:hanging="360"/>
+      </w:pPr>
+      <w:rPr>
+        <w:rFonts w:ascii="Wingdings" w:hAnsi="Wingdings" w:hint="default"/>
+      </w:rPr>
+    </w:lvl>
+    <w:lvl w:ilvl="6" w:tplc="10090001" w:tentative="1">
+      <w:start w:val="1"/>
+      <w:numFmt w:val="bullet"/>
+      <w:lvlText w:val=""/>
+      <w:lvlJc w:val="left"/>
+      <w:pPr>
+        <w:ind w:left="5400" w:hanging="360"/>
+      </w:pPr>
+      <w:rPr>
+        <w:rFonts w:ascii="Symbol" w:hAnsi="Symbol" w:hint="default"/>
+      </w:rPr>
+    </w:lvl>
+    <w:lvl w:ilvl="7" w:tplc="10090003" w:tentative="1">
+      <w:start w:val="1"/>
+      <w:numFmt w:val="bullet"/>
+      <w:lvlText w:val="o"/>
+      <w:lvlJc w:val="left"/>
+      <w:pPr>
+        <w:ind w:left="6120" w:hanging="360"/>
+      </w:pPr>
+      <w:rPr>
+        <w:rFonts w:ascii="Courier New" w:hAnsi="Courier New" w:cs="Courier New" w:hint="default"/>
+      </w:rPr>
+    </w:lvl>
+    <w:lvl w:ilvl="8" w:tplc="10090005" w:tentative="1">
+      <w:start w:val="1"/>
+      <w:numFmt w:val="bullet"/>
+      <w:lvlText w:val=""/>
+      <w:lvlJc w:val="left"/>
+      <w:pPr>
+        <w:ind w:left="6840" w:hanging="360"/>
+      </w:pPr>
+      <w:rPr>
+        <w:rFonts w:ascii="Wingdings" w:hAnsi="Wingdings" w:hint="default"/>
+      </w:rPr>
+    </w:lvl>
+  </w:abstractNum>
+  <w:abstractNum w:abstractNumId="10" w15:restartNumberingAfterBreak="0">
     <w:nsid w:val="3D034E77"/>
     <w:multiLevelType w:val="hybridMultilevel"/>
     <w:tmpl w:val="D4427AAA"/>
@@ -3215,7 +3439,7 @@
       </w:rPr>
     </w:lvl>
   </w:abstractNum>
-  <w:abstractNum w:abstractNumId="8" w15:restartNumberingAfterBreak="0">
+  <w:abstractNum w:abstractNumId="11" w15:restartNumberingAfterBreak="0">
     <w:nsid w:val="3E592ADB"/>
     <w:multiLevelType w:val="hybridMultilevel"/>
     <w:tmpl w:val="A808E346"/>
@@ -3327,7 +3551,120 @@
       </w:rPr>
     </w:lvl>
   </w:abstractNum>
-  <w:abstractNum w:abstractNumId="9" w15:restartNumberingAfterBreak="0">
+  <w:abstractNum w:abstractNumId="12" w15:restartNumberingAfterBreak="0">
+    <w:nsid w:val="437F1303"/>
+    <w:multiLevelType w:val="hybridMultilevel"/>
+    <w:tmpl w:val="31ECA7DE"/>
+    <w:lvl w:ilvl="0" w:tplc="10090001">
+      <w:start w:val="1"/>
+      <w:numFmt w:val="bullet"/>
+      <w:lvlText w:val=""/>
+      <w:lvlJc w:val="left"/>
+      <w:pPr>
+        <w:ind w:left="360" w:hanging="360"/>
+      </w:pPr>
+      <w:rPr>
+        <w:rFonts w:ascii="Symbol" w:hAnsi="Symbol" w:hint="default"/>
+      </w:rPr>
+    </w:lvl>
+    <w:lvl w:ilvl="1" w:tplc="10090003">
+      <w:start w:val="1"/>
+      <w:numFmt w:val="bullet"/>
+      <w:lvlText w:val="o"/>
+      <w:lvlJc w:val="left"/>
+      <w:pPr>
+        <w:ind w:left="1080" w:hanging="360"/>
+      </w:pPr>
+      <w:rPr>
+        <w:rFonts w:ascii="Courier New" w:hAnsi="Courier New" w:cs="Courier New" w:hint="default"/>
+      </w:rPr>
+    </w:lvl>
+    <w:lvl w:ilvl="2" w:tplc="10090005" w:tentative="1">
+      <w:start w:val="1"/>
+      <w:numFmt w:val="bullet"/>
+      <w:lvlText w:val=""/>
+      <w:lvlJc w:val="left"/>
+      <w:pPr>
+        <w:ind w:left="1800" w:hanging="360"/>
+      </w:pPr>
+      <w:rPr>
+        <w:rFonts w:ascii="Wingdings" w:hAnsi="Wingdings" w:hint="default"/>
+      </w:rPr>
+    </w:lvl>
+    <w:lvl w:ilvl="3" w:tplc="10090001" w:tentative="1">
+      <w:start w:val="1"/>
+      <w:numFmt w:val="bullet"/>
+      <w:lvlText w:val=""/>
+      <w:lvlJc w:val="left"/>
+      <w:pPr>
+        <w:ind w:left="2520" w:hanging="360"/>
+      </w:pPr>
+      <w:rPr>
+        <w:rFonts w:ascii="Symbol" w:hAnsi="Symbol" w:hint="default"/>
+      </w:rPr>
+    </w:lvl>
+    <w:lvl w:ilvl="4" w:tplc="10090003" w:tentative="1">
+      <w:start w:val="1"/>
+      <w:numFmt w:val="bullet"/>
+      <w:lvlText w:val="o"/>
+      <w:lvlJc w:val="left"/>
+      <w:pPr>
+        <w:ind w:left="3240" w:hanging="360"/>
+      </w:pPr>
+      <w:rPr>
+        <w:rFonts w:ascii="Courier New" w:hAnsi="Courier New" w:cs="Courier New" w:hint="default"/>
+      </w:rPr>
+    </w:lvl>
+    <w:lvl w:ilvl="5" w:tplc="10090005" w:tentative="1">
+      <w:start w:val="1"/>
+      <w:numFmt w:val="bullet"/>
+      <w:lvlText w:val=""/>
+      <w:lvlJc w:val="left"/>
+      <w:pPr>
+        <w:ind w:left="3960" w:hanging="360"/>
+      </w:pPr>
+      <w:rPr>
+        <w:rFonts w:ascii="Wingdings" w:hAnsi="Wingdings" w:hint="default"/>
+      </w:rPr>
+    </w:lvl>
+    <w:lvl w:ilvl="6" w:tplc="10090001" w:tentative="1">
+      <w:start w:val="1"/>
+      <w:numFmt w:val="bullet"/>
+      <w:lvlText w:val=""/>
+      <w:lvlJc w:val="left"/>
+      <w:pPr>
+        <w:ind w:left="4680" w:hanging="360"/>
+      </w:pPr>
+      <w:rPr>
+        <w:rFonts w:ascii="Symbol" w:hAnsi="Symbol" w:hint="default"/>
+      </w:rPr>
+    </w:lvl>
+    <w:lvl w:ilvl="7" w:tplc="10090003" w:tentative="1">
+      <w:start w:val="1"/>
+      <w:numFmt w:val="bullet"/>
+      <w:lvlText w:val="o"/>
+      <w:lvlJc w:val="left"/>
+      <w:pPr>
+        <w:ind w:left="5400" w:hanging="360"/>
+      </w:pPr>
+      <w:rPr>
+        <w:rFonts w:ascii="Courier New" w:hAnsi="Courier New" w:cs="Courier New" w:hint="default"/>
+      </w:rPr>
+    </w:lvl>
+    <w:lvl w:ilvl="8" w:tplc="10090005" w:tentative="1">
+      <w:start w:val="1"/>
+      <w:numFmt w:val="bullet"/>
+      <w:lvlText w:val=""/>
+      <w:lvlJc w:val="left"/>
+      <w:pPr>
+        <w:ind w:left="6120" w:hanging="360"/>
+      </w:pPr>
+      <w:rPr>
+        <w:rFonts w:ascii="Wingdings" w:hAnsi="Wingdings" w:hint="default"/>
+      </w:rPr>
+    </w:lvl>
+  </w:abstractNum>
+  <w:abstractNum w:abstractNumId="13" w15:restartNumberingAfterBreak="0">
     <w:nsid w:val="48F21F63"/>
     <w:multiLevelType w:val="hybridMultilevel"/>
     <w:tmpl w:val="3BD8347E"/>
@@ -3416,7 +3753,7 @@
       </w:pPr>
     </w:lvl>
   </w:abstractNum>
-  <w:abstractNum w:abstractNumId="10" w15:restartNumberingAfterBreak="0">
+  <w:abstractNum w:abstractNumId="14" w15:restartNumberingAfterBreak="0">
     <w:nsid w:val="4EA0069A"/>
     <w:multiLevelType w:val="hybridMultilevel"/>
     <w:tmpl w:val="EB4A0F00"/>
@@ -3528,7 +3865,7 @@
       </w:rPr>
     </w:lvl>
   </w:abstractNum>
-  <w:abstractNum w:abstractNumId="11" w15:restartNumberingAfterBreak="0">
+  <w:abstractNum w:abstractNumId="15" w15:restartNumberingAfterBreak="0">
     <w:nsid w:val="50DE2827"/>
     <w:multiLevelType w:val="hybridMultilevel"/>
     <w:tmpl w:val="54ACB31C"/>
@@ -3640,7 +3977,7 @@
       </w:rPr>
     </w:lvl>
   </w:abstractNum>
-  <w:abstractNum w:abstractNumId="12" w15:restartNumberingAfterBreak="0">
+  <w:abstractNum w:abstractNumId="16" w15:restartNumberingAfterBreak="0">
     <w:nsid w:val="53C44481"/>
     <w:multiLevelType w:val="hybridMultilevel"/>
     <w:tmpl w:val="794CD150"/>
@@ -3753,7 +4090,7 @@
       </w:rPr>
     </w:lvl>
   </w:abstractNum>
-  <w:abstractNum w:abstractNumId="13" w15:restartNumberingAfterBreak="0">
+  <w:abstractNum w:abstractNumId="17" w15:restartNumberingAfterBreak="0">
     <w:nsid w:val="58A5691C"/>
     <w:multiLevelType w:val="hybridMultilevel"/>
     <w:tmpl w:val="5186D9E6"/>
@@ -3865,7 +4202,120 @@
       </w:rPr>
     </w:lvl>
   </w:abstractNum>
-  <w:abstractNum w:abstractNumId="14" w15:restartNumberingAfterBreak="0">
+  <w:abstractNum w:abstractNumId="18" w15:restartNumberingAfterBreak="0">
+    <w:nsid w:val="5AD30FF3"/>
+    <w:multiLevelType w:val="hybridMultilevel"/>
+    <w:tmpl w:val="FD08B556"/>
+    <w:lvl w:ilvl="0" w:tplc="10090001">
+      <w:start w:val="1"/>
+      <w:numFmt w:val="bullet"/>
+      <w:lvlText w:val=""/>
+      <w:lvlJc w:val="left"/>
+      <w:pPr>
+        <w:ind w:left="720" w:hanging="360"/>
+      </w:pPr>
+      <w:rPr>
+        <w:rFonts w:ascii="Symbol" w:hAnsi="Symbol" w:hint="default"/>
+      </w:rPr>
+    </w:lvl>
+    <w:lvl w:ilvl="1" w:tplc="10090003" w:tentative="1">
+      <w:start w:val="1"/>
+      <w:numFmt w:val="bullet"/>
+      <w:lvlText w:val="o"/>
+      <w:lvlJc w:val="left"/>
+      <w:pPr>
+        <w:ind w:left="1440" w:hanging="360"/>
+      </w:pPr>
+      <w:rPr>
+        <w:rFonts w:ascii="Courier New" w:hAnsi="Courier New" w:cs="Courier New" w:hint="default"/>
+      </w:rPr>
+    </w:lvl>
+    <w:lvl w:ilvl="2" w:tplc="10090005" w:tentative="1">
+      <w:start w:val="1"/>
+      <w:numFmt w:val="bullet"/>
+      <w:lvlText w:val=""/>
+      <w:lvlJc w:val="left"/>
+      <w:pPr>
+        <w:ind w:left="2160" w:hanging="360"/>
+      </w:pPr>
+      <w:rPr>
+        <w:rFonts w:ascii="Wingdings" w:hAnsi="Wingdings" w:hint="default"/>
+      </w:rPr>
+    </w:lvl>
+    <w:lvl w:ilvl="3" w:tplc="10090001" w:tentative="1">
+      <w:start w:val="1"/>
+      <w:numFmt w:val="bullet"/>
+      <w:lvlText w:val=""/>
+      <w:lvlJc w:val="left"/>
+      <w:pPr>
+        <w:ind w:left="2880" w:hanging="360"/>
+      </w:pPr>
+      <w:rPr>
+        <w:rFonts w:ascii="Symbol" w:hAnsi="Symbol" w:hint="default"/>
+      </w:rPr>
+    </w:lvl>
+    <w:lvl w:ilvl="4" w:tplc="10090003" w:tentative="1">
+      <w:start w:val="1"/>
+      <w:numFmt w:val="bullet"/>
+      <w:lvlText w:val="o"/>
+      <w:lvlJc w:val="left"/>
+      <w:pPr>
+        <w:ind w:left="3600" w:hanging="360"/>
+      </w:pPr>
+      <w:rPr>
+        <w:rFonts w:ascii="Courier New" w:hAnsi="Courier New" w:cs="Courier New" w:hint="default"/>
+      </w:rPr>
+    </w:lvl>
+    <w:lvl w:ilvl="5" w:tplc="10090005" w:tentative="1">
+      <w:start w:val="1"/>
+      <w:numFmt w:val="bullet"/>
+      <w:lvlText w:val=""/>
+      <w:lvlJc w:val="left"/>
+      <w:pPr>
+        <w:ind w:left="4320" w:hanging="360"/>
+      </w:pPr>
+      <w:rPr>
+        <w:rFonts w:ascii="Wingdings" w:hAnsi="Wingdings" w:hint="default"/>
+      </w:rPr>
+    </w:lvl>
+    <w:lvl w:ilvl="6" w:tplc="10090001" w:tentative="1">
+      <w:start w:val="1"/>
+      <w:numFmt w:val="bullet"/>
+      <w:lvlText w:val=""/>
+      <w:lvlJc w:val="left"/>
+      <w:pPr>
+        <w:ind w:left="5040" w:hanging="360"/>
+      </w:pPr>
+      <w:rPr>
+        <w:rFonts w:ascii="Symbol" w:hAnsi="Symbol" w:hint="default"/>
+      </w:rPr>
+    </w:lvl>
+    <w:lvl w:ilvl="7" w:tplc="10090003" w:tentative="1">
+      <w:start w:val="1"/>
+      <w:numFmt w:val="bullet"/>
+      <w:lvlText w:val="o"/>
+      <w:lvlJc w:val="left"/>
+      <w:pPr>
+        <w:ind w:left="5760" w:hanging="360"/>
+      </w:pPr>
+      <w:rPr>
+        <w:rFonts w:ascii="Courier New" w:hAnsi="Courier New" w:cs="Courier New" w:hint="default"/>
+      </w:rPr>
+    </w:lvl>
+    <w:lvl w:ilvl="8" w:tplc="10090005" w:tentative="1">
+      <w:start w:val="1"/>
+      <w:numFmt w:val="bullet"/>
+      <w:lvlText w:val=""/>
+      <w:lvlJc w:val="left"/>
+      <w:pPr>
+        <w:ind w:left="6480" w:hanging="360"/>
+      </w:pPr>
+      <w:rPr>
+        <w:rFonts w:ascii="Wingdings" w:hAnsi="Wingdings" w:hint="default"/>
+      </w:rPr>
+    </w:lvl>
+  </w:abstractNum>
+  <w:abstractNum w:abstractNumId="19" w15:restartNumberingAfterBreak="0">
     <w:nsid w:val="6D48331C"/>
     <w:multiLevelType w:val="hybridMultilevel"/>
     <w:tmpl w:val="FF5CFAEA"/>
@@ -3954,7 +4404,7 @@
       </w:pPr>
     </w:lvl>
   </w:abstractNum>
-  <w:abstractNum w:abstractNumId="15" w15:restartNumberingAfterBreak="0">
+  <w:abstractNum w:abstractNumId="20" w15:restartNumberingAfterBreak="0">
     <w:nsid w:val="76045B4E"/>
     <w:multiLevelType w:val="hybridMultilevel"/>
     <w:tmpl w:val="18FE403E"/>
@@ -4067,7 +4517,7 @@
       </w:rPr>
     </w:lvl>
   </w:abstractNum>
-  <w:abstractNum w:abstractNumId="16" w15:restartNumberingAfterBreak="0">
+  <w:abstractNum w:abstractNumId="21" w15:restartNumberingAfterBreak="0">
     <w:nsid w:val="76C0015A"/>
     <w:multiLevelType w:val="hybridMultilevel"/>
     <w:tmpl w:val="279276A4"/>
@@ -4179,7 +4629,7 @@
       </w:rPr>
     </w:lvl>
   </w:abstractNum>
-  <w:abstractNum w:abstractNumId="17" w15:restartNumberingAfterBreak="0">
+  <w:abstractNum w:abstractNumId="22" w15:restartNumberingAfterBreak="0">
     <w:nsid w:val="7BD73D28"/>
     <w:multiLevelType w:val="hybridMultilevel"/>
     <w:tmpl w:val="B8E0ED76"/>
@@ -4295,55 +4745,70 @@
     <w:abstractNumId w:val="0"/>
   </w:num>
   <w:num w:numId="2" w16cid:durableId="1946687648">
-    <w:abstractNumId w:val="15"/>
+    <w:abstractNumId w:val="20"/>
   </w:num>
   <w:num w:numId="3" w16cid:durableId="852570452">
-    <w:abstractNumId w:val="9"/>
+    <w:abstractNumId w:val="13"/>
   </w:num>
   <w:num w:numId="4" w16cid:durableId="1751853130">
-    <w:abstractNumId w:val="12"/>
+    <w:abstractNumId w:val="16"/>
   </w:num>
   <w:num w:numId="5" w16cid:durableId="1806000535">
-    <w:abstractNumId w:val="5"/>
+    <w:abstractNumId w:val="6"/>
   </w:num>
   <w:num w:numId="6" w16cid:durableId="1739478424">
-    <w:abstractNumId w:val="3"/>
+    <w:abstractNumId w:val="4"/>
   </w:num>
   <w:num w:numId="7" w16cid:durableId="494298078">
     <w:abstractNumId w:val="2"/>
   </w:num>
   <w:num w:numId="8" w16cid:durableId="856193639">
-    <w:abstractNumId w:val="4"/>
+    <w:abstractNumId w:val="5"/>
   </w:num>
   <w:num w:numId="9" w16cid:durableId="1972708957">
     <w:abstractNumId w:val="1"/>
   </w:num>
   <w:num w:numId="10" w16cid:durableId="828980383">
+    <w:abstractNumId w:val="15"/>
+  </w:num>
+  <w:num w:numId="11" w16cid:durableId="1022508816">
+    <w:abstractNumId w:val="22"/>
+  </w:num>
+  <w:num w:numId="12" w16cid:durableId="142553659">
+    <w:abstractNumId w:val="8"/>
+  </w:num>
+  <w:num w:numId="13" w16cid:durableId="1716848753">
+    <w:abstractNumId w:val="21"/>
+  </w:num>
+  <w:num w:numId="14" w16cid:durableId="1460755852">
+    <w:abstractNumId w:val="19"/>
+  </w:num>
+  <w:num w:numId="15" w16cid:durableId="1857845718">
+    <w:abstractNumId w:val="17"/>
+  </w:num>
+  <w:num w:numId="16" w16cid:durableId="915087556">
     <w:abstractNumId w:val="11"/>
   </w:num>
-  <w:num w:numId="11" w16cid:durableId="1022508816">
-    <w:abstractNumId w:val="17"/>
-  </w:num>
-  <w:num w:numId="12" w16cid:durableId="142553659">
-    <w:abstractNumId w:val="6"/>
-  </w:num>
-  <w:num w:numId="13" w16cid:durableId="1716848753">
-    <w:abstractNumId w:val="16"/>
-  </w:num>
-  <w:num w:numId="14" w16cid:durableId="1460755852">
+  <w:num w:numId="17" w16cid:durableId="151455051">
     <w:abstractNumId w:val="14"/>
   </w:num>
-  <w:num w:numId="15" w16cid:durableId="1857845718">
-    <w:abstractNumId w:val="13"/>
-  </w:num>
-  <w:num w:numId="16" w16cid:durableId="915087556">
-    <w:abstractNumId w:val="8"/>
-  </w:num>
-  <w:num w:numId="17" w16cid:durableId="151455051">
+  <w:num w:numId="18" w16cid:durableId="1736197986">
     <w:abstractNumId w:val="10"/>
   </w:num>
-  <w:num w:numId="18" w16cid:durableId="1736197986">
+  <w:num w:numId="19" w16cid:durableId="1445686765">
+    <w:abstractNumId w:val="18"/>
+  </w:num>
+  <w:num w:numId="20" w16cid:durableId="556278099">
     <w:abstractNumId w:val="7"/>
+  </w:num>
+  <w:num w:numId="21" w16cid:durableId="473256920">
+    <w:abstractNumId w:val="12"/>
+  </w:num>
+  <w:num w:numId="22" w16cid:durableId="746920508">
+    <w:abstractNumId w:val="3"/>
+  </w:num>
+  <w:num w:numId="23" w16cid:durableId="201598549">
+    <w:abstractNumId w:val="9"/>
   </w:num>
 </w:numbering>
 </file>
@@ -4799,7 +5264,6 @@
     <w:next w:val="Normal"/>
     <w:link w:val="Heading3Char"/>
     <w:uiPriority w:val="9"/>
-    <w:semiHidden/>
     <w:unhideWhenUsed/>
     <w:qFormat/>
     <w:rsid w:val="00246F4F"/>
@@ -4822,7 +5286,6 @@
     <w:next w:val="Normal"/>
     <w:link w:val="Heading4Char"/>
     <w:uiPriority w:val="9"/>
-    <w:semiHidden/>
     <w:unhideWhenUsed/>
     <w:qFormat/>
     <w:rsid w:val="00246F4F"/>
@@ -4951,6 +5414,7 @@
   <w:style w:type="character" w:default="1" w:styleId="DefaultParagraphFont">
     <w:name w:val="Default Paragraph Font"/>
     <w:uiPriority w:val="1"/>
+    <w:semiHidden/>
     <w:unhideWhenUsed/>
   </w:style>
   <w:style w:type="table" w:default="1" w:styleId="TableNormal">
@@ -5005,7 +5469,6 @@
     <w:basedOn w:val="DefaultParagraphFont"/>
     <w:link w:val="Heading3"/>
     <w:uiPriority w:val="9"/>
-    <w:semiHidden/>
     <w:rsid w:val="00246F4F"/>
     <w:rPr>
       <w:rFonts w:eastAsiaTheme="majorEastAsia" w:cstheme="majorBidi"/>
@@ -5019,7 +5482,6 @@
     <w:basedOn w:val="DefaultParagraphFont"/>
     <w:link w:val="Heading4"/>
     <w:uiPriority w:val="9"/>
-    <w:semiHidden/>
     <w:rsid w:val="00246F4F"/>
     <w:rPr>
       <w:rFonts w:eastAsiaTheme="majorEastAsia" w:cstheme="majorBidi"/>

</xml_diff>

<commit_message>
fixd some issues in part 1 of the word doc
</commit_message>
<xml_diff>
--- a/assignment4/report.docx
+++ b/assignment4/report.docx
@@ -46,8 +46,30 @@
           <w:t>https://fbinfer.com/docs/getting-started/</w:t>
         </w:r>
       </w:hyperlink>
-    </w:p>
-    <w:p>
+      <w:r>
+        <w:t xml:space="preserve"> (For Kylen)</w:t>
+      </w:r>
+    </w:p>
+    <w:p>
+      <w:r>
+        <w:t xml:space="preserve">Binary release from  </w:t>
+      </w:r>
+      <w:hyperlink r:id="rId6" w:history="1">
+        <w:r>
+          <w:rPr>
+            <w:rStyle w:val="Hyperlink"/>
+          </w:rPr>
+          <w:t>https://github.com/facebook/infer/releases/latest</w:t>
+        </w:r>
+      </w:hyperlink>
+      <w:r>
+        <w:t xml:space="preserve"> (For Vlad) </w:t>
+      </w:r>
+    </w:p>
+    <w:p>
+      <w:r>
+        <w:t xml:space="preserve">Infer </w:t>
+      </w:r>
       <w:r>
         <w:t>Version 1.2.0</w:t>
       </w:r>
@@ -65,7 +87,21 @@
         <w:t>WSL Ubuntu 22.04.5 LTS</w:t>
       </w:r>
       <w:r>
-        <w:t xml:space="preserve"> (For Kylen at least)</w:t>
+        <w:t xml:space="preserve"> (For Kylen)</w:t>
+      </w:r>
+    </w:p>
+    <w:p>
+      <w:r>
+        <w:t>WSL Ubuntu 22.04.</w:t>
+      </w:r>
+      <w:r>
+        <w:t>3</w:t>
+      </w:r>
+      <w:r>
+        <w:t xml:space="preserve"> LTS</w:t>
+      </w:r>
+      <w:r>
+        <w:t xml:space="preserve"> (For Vlad)</w:t>
       </w:r>
     </w:p>
     <w:p>
@@ -81,18 +117,13 @@
     </w:p>
     <w:p>
       <w:r>
-        <w:t>java/</w:t>
-      </w:r>
-      <w:proofErr w:type="spellStart"/>
-      <w:r>
-        <w:t>javac</w:t>
-      </w:r>
-      <w:proofErr w:type="spellEnd"/>
-      <w:r>
-        <w:t xml:space="preserve"> </w:t>
+        <w:t xml:space="preserve">java/javac </w:t>
       </w:r>
       <w:r>
         <w:t>21.0.10</w:t>
+      </w:r>
+      <w:r>
+        <w:t xml:space="preserve"> (For Kylen and Vlad</w:t>
       </w:r>
     </w:p>
     <w:p>
@@ -108,13 +139,27 @@
     </w:p>
     <w:p>
       <w:r>
+        <w:t xml:space="preserve">Apache </w:t>
+      </w:r>
+      <w:r>
         <w:t>M</w:t>
       </w:r>
       <w:r>
-        <w:t xml:space="preserve">aven </w:t>
-      </w:r>
-      <w:r>
-        <w:t>xxx</w:t>
+        <w:t>aven</w:t>
+      </w:r>
+      <w:r>
+        <w:t xml:space="preserve"> 3.9.12</w:t>
+      </w:r>
+      <w:r>
+        <w:t xml:space="preserve"> found </w:t>
+      </w:r>
+      <w:proofErr w:type="gramStart"/>
+      <w:r>
+        <w:t>running .</w:t>
+      </w:r>
+      <w:proofErr w:type="gramEnd"/>
+      <w:r>
+        <w:t>/mvnw -version</w:t>
       </w:r>
     </w:p>
     <w:p>
@@ -126,7 +171,7 @@
       </w:r>
     </w:p>
     <w:p>
-      <w:hyperlink r:id="rId6" w:history="1">
+      <w:hyperlink r:id="rId7" w:history="1">
         <w:r>
           <w:rPr>
             <w:rStyle w:val="Hyperlink"/>
@@ -135,6 +180,17 @@
           <w:t>https://github.com/vavr-io/vavr.git</w:t>
         </w:r>
       </w:hyperlink>
+      <w:r>
+        <w:t xml:space="preserve"> Commit hash </w:t>
+      </w:r>
+      <w:hyperlink r:id="rId8" w:history="1">
+        <w:r>
+          <w:rPr>
+            <w:rStyle w:val="Hyperlink"/>
+          </w:rPr>
+          <w:t>598a691</w:t>
+        </w:r>
+      </w:hyperlink>
     </w:p>
     <w:p>
       <w:r>
@@ -151,26 +207,45 @@
       </w:r>
     </w:p>
     <w:p>
+      <w:pPr>
+        <w:ind w:firstLine="720"/>
+      </w:pPr>
+      <w:r>
+        <w:t xml:space="preserve">Using </w:t>
+      </w:r>
+      <w:r>
+        <w:t>git ls-files | xargs wc -l</w:t>
+      </w:r>
       <w:r>
         <w:t xml:space="preserve"> </w:t>
       </w:r>
-      <w:r>
-        <w:t>127</w:t>
+    </w:p>
+    <w:p>
+      <w:pPr>
+        <w:ind w:firstLine="720"/>
+      </w:pPr>
+      <w:r>
+        <w:t xml:space="preserve">We </w:t>
+      </w:r>
+      <w:proofErr w:type="gramStart"/>
+      <w:r>
+        <w:t xml:space="preserve">find </w:t>
+      </w:r>
+      <w:r>
+        <w:t xml:space="preserve"> 135</w:t>
       </w:r>
       <w:r>
         <w:t>,</w:t>
       </w:r>
       <w:r>
-        <w:t>257</w:t>
-      </w:r>
-      <w:r>
-        <w:t xml:space="preserve"> </w:t>
-      </w:r>
-      <w:r>
-        <w:rPr>
-          <w:highlight w:val="yellow"/>
-        </w:rPr>
-        <w:t>(I think?)</w:t>
+        <w:t>018</w:t>
+      </w:r>
+      <w:proofErr w:type="gramEnd"/>
+      <w:r>
+        <w:t xml:space="preserve"> total</w:t>
+      </w:r>
+      <w:r>
+        <w:t xml:space="preserve"> lines of code inside of the vavr repo </w:t>
       </w:r>
     </w:p>
     <w:p>
@@ -226,24 +301,16 @@
         <w:t xml:space="preserve">. </w:t>
       </w:r>
       <w:r>
-        <w:t>Many fixes were tried, including ensuring environment variables pointed to version 21 of java/</w:t>
-      </w:r>
-      <w:proofErr w:type="spellStart"/>
-      <w:r>
-        <w:t>javac</w:t>
-      </w:r>
-      <w:proofErr w:type="spellEnd"/>
-      <w:r>
-        <w:t>, forcing the version with “</w:t>
+        <w:t>Many fixes were tried, including ensuring environment variables pointed to version 21 of java/javac, forcing the version with “</w:t>
       </w:r>
       <w:r>
         <w:t>-</w:t>
       </w:r>
-      <w:proofErr w:type="spellStart"/>
+      <w:proofErr w:type="gramStart"/>
       <w:r>
         <w:t>Dmaven.compiler.source</w:t>
       </w:r>
-      <w:proofErr w:type="spellEnd"/>
+      <w:proofErr w:type="gramEnd"/>
       <w:r>
         <w:t>=21</w:t>
       </w:r>
@@ -251,15 +318,7 @@
         <w:t>” and “</w:t>
       </w:r>
       <w:r>
-        <w:t>-</w:t>
-      </w:r>
-      <w:proofErr w:type="spellStart"/>
-      <w:r>
-        <w:t>Djava.version</w:t>
-      </w:r>
-      <w:proofErr w:type="spellEnd"/>
-      <w:r>
-        <w:t>=21</w:t>
+        <w:t>-Djava.version=21</w:t>
       </w:r>
       <w:r>
         <w:t xml:space="preserve">” </w:t>
@@ -276,56 +335,46 @@
     </w:p>
     <w:p>
       <w:r>
-        <w:t xml:space="preserve">Note that </w:t>
-      </w:r>
-      <w:proofErr w:type="spellStart"/>
-      <w:r>
-        <w:t>vavr</w:t>
-      </w:r>
-      <w:proofErr w:type="spellEnd"/>
+        <w:lastRenderedPageBreak/>
+        <w:t xml:space="preserve">Note that vavr </w:t>
+      </w:r>
+      <w:r>
+        <w:t>compiled</w:t>
+      </w:r>
+      <w:r>
+        <w:t xml:space="preserve"> fine without infer, so infer was injecting version 11 of java without being asked. </w:t>
+      </w:r>
+    </w:p>
+    <w:p>
+      <w:r>
+        <w:t>Finally</w:t>
+      </w:r>
+      <w:r>
+        <w:t xml:space="preserve">, the fix that worked: </w:t>
+      </w:r>
+      <w:r>
+        <w:t>a</w:t>
+      </w:r>
+      <w:r>
+        <w:t>dd</w:t>
+      </w:r>
+      <w:r>
+        <w:t>ing</w:t>
+      </w:r>
+      <w:r>
+        <w:t xml:space="preserve"> a</w:t>
+      </w:r>
       <w:r>
         <w:t xml:space="preserve"> </w:t>
       </w:r>
-      <w:r>
-        <w:t>compiled</w:t>
-      </w:r>
-      <w:r>
-        <w:t xml:space="preserve"> fine without infer, so infer was injecting version 11 of java without being asked. </w:t>
-      </w:r>
-    </w:p>
-    <w:p>
-      <w:r>
-        <w:t>Finally</w:t>
-      </w:r>
-      <w:r>
-        <w:t xml:space="preserve">, the fix that worked: </w:t>
-      </w:r>
-      <w:r>
-        <w:t>a</w:t>
-      </w:r>
-      <w:r>
-        <w:t>dd</w:t>
-      </w:r>
-      <w:r>
-        <w:t>ing</w:t>
-      </w:r>
-      <w:r>
-        <w:t xml:space="preserve"> a</w:t>
-      </w:r>
-      <w:r>
-        <w:t xml:space="preserve"> </w:t>
-      </w:r>
+      <w:proofErr w:type="gramStart"/>
       <w:r>
         <w:t>“</w:t>
       </w:r>
       <w:r>
-        <w:t>.</w:t>
-      </w:r>
-      <w:proofErr w:type="spellStart"/>
-      <w:r>
-        <w:t>inferconfig</w:t>
-      </w:r>
-      <w:proofErr w:type="spellEnd"/>
+        <w:t>.inferconfig</w:t>
+      </w:r>
+      <w:proofErr w:type="gramEnd"/>
       <w:r>
         <w:t>”</w:t>
       </w:r>
@@ -333,15 +382,7 @@
         <w:t xml:space="preserve"> file</w:t>
       </w:r>
       <w:r>
-        <w:t xml:space="preserve"> to the root /</w:t>
-      </w:r>
-      <w:proofErr w:type="spellStart"/>
-      <w:r>
-        <w:t>vavr</w:t>
-      </w:r>
-      <w:proofErr w:type="spellEnd"/>
-      <w:r>
-        <w:t>/ dir</w:t>
+        <w:t xml:space="preserve"> to the root /vavr/ dir</w:t>
       </w:r>
       <w:r>
         <w:t>ectory</w:t>
@@ -365,7 +406,6 @@
     </w:p>
     <w:p>
       <w:r>
-        <w:lastRenderedPageBreak/>
         <w:t>Then run</w:t>
       </w:r>
       <w:r>
@@ -380,21 +420,21 @@
         <w:rPr>
           <w:rFonts w:ascii="Consolas" w:hAnsi="Consolas"/>
         </w:rPr>
-        <w:t>infer run -- ./</w:t>
-      </w:r>
-      <w:proofErr w:type="spellStart"/>
+        <w:t xml:space="preserve">infer run </w:t>
+      </w:r>
+      <w:proofErr w:type="gramStart"/>
       <w:r>
         <w:rPr>
           <w:rFonts w:ascii="Consolas" w:hAnsi="Consolas"/>
         </w:rPr>
-        <w:t>mvnw</w:t>
-      </w:r>
-      <w:proofErr w:type="spellEnd"/>
+        <w:t>-- .</w:t>
+      </w:r>
+      <w:proofErr w:type="gramEnd"/>
       <w:r>
         <w:rPr>
           <w:rFonts w:ascii="Consolas" w:hAnsi="Consolas"/>
         </w:rPr>
-        <w:t xml:space="preserve"> clean compile</w:t>
+        <w:t>/mvnw clean compile</w:t>
       </w:r>
     </w:p>
     <w:p>
@@ -415,49 +455,7 @@
         <w:rPr>
           <w:rFonts w:ascii="Consolas" w:hAnsi="Consolas"/>
         </w:rPr>
-        <w:t xml:space="preserve">find </w:t>
-      </w:r>
-      <w:proofErr w:type="spellStart"/>
-      <w:r>
-        <w:rPr>
-          <w:rFonts w:ascii="Consolas" w:hAnsi="Consolas"/>
-        </w:rPr>
-        <w:t>vavr</w:t>
-      </w:r>
-      <w:proofErr w:type="spellEnd"/>
-      <w:r>
-        <w:rPr>
-          <w:rFonts w:ascii="Consolas" w:hAnsi="Consolas"/>
-        </w:rPr>
-        <w:t xml:space="preserve"> -name "*.java" | </w:t>
-      </w:r>
-      <w:proofErr w:type="spellStart"/>
-      <w:r>
-        <w:rPr>
-          <w:rFonts w:ascii="Consolas" w:hAnsi="Consolas"/>
-        </w:rPr>
-        <w:t>xargs</w:t>
-      </w:r>
-      <w:proofErr w:type="spellEnd"/>
-      <w:r>
-        <w:rPr>
-          <w:rFonts w:ascii="Consolas" w:hAnsi="Consolas"/>
-        </w:rPr>
-        <w:t xml:space="preserve"> </w:t>
-      </w:r>
-      <w:proofErr w:type="spellStart"/>
-      <w:r>
-        <w:rPr>
-          <w:rFonts w:ascii="Consolas" w:hAnsi="Consolas"/>
-        </w:rPr>
-        <w:t>wc</w:t>
-      </w:r>
-      <w:proofErr w:type="spellEnd"/>
-      <w:r>
-        <w:rPr>
-          <w:rFonts w:ascii="Consolas" w:hAnsi="Consolas"/>
-        </w:rPr>
-        <w:t xml:space="preserve"> -l</w:t>
+        <w:t>find vavr -name "*.java" | xargs wc -l</w:t>
       </w:r>
     </w:p>
     <w:p>
@@ -612,11 +610,9 @@
             <w:tcW w:w="988" w:type="dxa"/>
           </w:tcPr>
           <w:p>
-            <w:proofErr w:type="spellStart"/>
             <w:r>
               <w:t>vavr</w:t>
             </w:r>
-            <w:proofErr w:type="spellEnd"/>
           </w:p>
         </w:tc>
         <w:tc>
@@ -749,33 +745,13 @@
         <w:pStyle w:val="Heading4"/>
       </w:pPr>
       <w:r>
+        <w:lastRenderedPageBreak/>
         <w:t>File and method name</w:t>
       </w:r>
     </w:p>
     <w:p>
-      <w:proofErr w:type="spellStart"/>
-      <w:r>
-        <w:t>vavr</w:t>
-      </w:r>
-      <w:proofErr w:type="spellEnd"/>
-      <w:r>
-        <w:t>/</w:t>
-      </w:r>
-      <w:proofErr w:type="spellStart"/>
-      <w:r>
-        <w:t>src</w:t>
-      </w:r>
-      <w:proofErr w:type="spellEnd"/>
-      <w:r>
-        <w:t>/main/java/io/</w:t>
-      </w:r>
-      <w:proofErr w:type="spellStart"/>
-      <w:r>
-        <w:t>vavr</w:t>
-      </w:r>
-      <w:proofErr w:type="spellEnd"/>
-      <w:r>
-        <w:t>/concurrent/FutureImpl.java:2</w:t>
+      <w:r>
+        <w:t>vavr/src/main/java/io/vavr/concurrent/FutureImpl.java:2</w:t>
       </w:r>
       <w:r>
         <w:t>35</w:t>
@@ -823,7 +799,7 @@
                     <pic:cNvPicPr/>
                   </pic:nvPicPr>
                   <pic:blipFill>
-                    <a:blip r:embed="rId7"/>
+                    <a:blip r:embed="rId9"/>
                     <a:stretch>
                       <a:fillRect/>
                     </a:stretch>
@@ -873,7 +849,7 @@
                     <pic:cNvPicPr/>
                   </pic:nvPicPr>
                   <pic:blipFill>
-                    <a:blip r:embed="rId8"/>
+                    <a:blip r:embed="rId10"/>
                     <a:stretch>
                       <a:fillRect/>
                     </a:stretch>
@@ -1735,7 +1711,7 @@
                     <pic:cNvPicPr/>
                   </pic:nvPicPr>
                   <pic:blipFill>
-                    <a:blip r:embed="rId9"/>
+                    <a:blip r:embed="rId11"/>
                     <a:stretch>
                       <a:fillRect/>
                     </a:stretch>
@@ -1806,13 +1782,8 @@
         <w:t xml:space="preserve"> </w:t>
       </w:r>
       <w:r>
-        <w:t xml:space="preserve">Experiment 5: Comparison with </w:t>
-      </w:r>
-      <w:proofErr w:type="spellStart"/>
-      <w:r>
-        <w:t>Semgrep</w:t>
-      </w:r>
-      <w:proofErr w:type="spellEnd"/>
+        <w:t>Experiment 5: Comparison with Semgrep</w:t>
+      </w:r>
     </w:p>
     <w:p>
       <w:pPr>
@@ -1847,15 +1818,7 @@
         <w:pStyle w:val="Heading4"/>
       </w:pPr>
       <w:r>
-        <w:t xml:space="preserve">Run </w:t>
-      </w:r>
-      <w:proofErr w:type="spellStart"/>
-      <w:r>
-        <w:t>Semgrep</w:t>
-      </w:r>
-      <w:proofErr w:type="spellEnd"/>
-      <w:r>
-        <w:t xml:space="preserve"> on the same repository using the default Java ruleset</w:t>
+        <w:t>Run Semgrep on the same repository using the default Java ruleset</w:t>
       </w:r>
     </w:p>
     <w:p>
@@ -1864,19 +1827,11 @@
           <w:rFonts w:ascii="Consolas" w:hAnsi="Consolas"/>
         </w:rPr>
       </w:pPr>
-      <w:proofErr w:type="spellStart"/>
       <w:r>
         <w:rPr>
           <w:rFonts w:ascii="Consolas" w:hAnsi="Consolas"/>
         </w:rPr>
-        <w:t>semgrep</w:t>
-      </w:r>
-      <w:proofErr w:type="spellEnd"/>
-      <w:r>
-        <w:rPr>
-          <w:rFonts w:ascii="Consolas" w:hAnsi="Consolas"/>
-        </w:rPr>
-        <w:t xml:space="preserve"> --config=p/java</w:t>
+        <w:t>semgrep --config=p/java</w:t>
       </w:r>
     </w:p>
     <w:p>
@@ -2023,11 +1978,9 @@
             <w:tcW w:w="2337" w:type="dxa"/>
           </w:tcPr>
           <w:p>
-            <w:proofErr w:type="spellStart"/>
             <w:r>
               <w:t>Semgrep</w:t>
             </w:r>
-            <w:proofErr w:type="spellEnd"/>
           </w:p>
         </w:tc>
         <w:tc>
@@ -2077,15 +2030,7 @@
         <w:pStyle w:val="Heading4"/>
       </w:pPr>
       <w:r>
-        <w:t xml:space="preserve">Why might </w:t>
-      </w:r>
-      <w:proofErr w:type="spellStart"/>
-      <w:r>
-        <w:t>Semgrep</w:t>
-      </w:r>
-      <w:proofErr w:type="spellEnd"/>
-      <w:r>
-        <w:t xml:space="preserve"> detect issues that Infer does not?</w:t>
+        <w:t>Why might Semgrep detect issues that Infer does not?</w:t>
       </w:r>
     </w:p>
     <w:p/>
@@ -2095,15 +2040,7 @@
       </w:pPr>
       <w:r>
         <w:lastRenderedPageBreak/>
-        <w:t xml:space="preserve">Why might Infer detect issues that </w:t>
-      </w:r>
-      <w:proofErr w:type="spellStart"/>
-      <w:r>
-        <w:t>Semgrep</w:t>
-      </w:r>
-      <w:proofErr w:type="spellEnd"/>
-      <w:r>
-        <w:t xml:space="preserve"> does not?</w:t>
+        <w:t>Why might Infer detect issues that Semgrep does not?</w:t>
       </w:r>
     </w:p>
     <w:p/>
@@ -5668,6 +5605,18 @@
       </w:tblBorders>
     </w:tblPr>
   </w:style>
+  <w:style w:type="character" w:styleId="FollowedHyperlink">
+    <w:name w:val="FollowedHyperlink"/>
+    <w:basedOn w:val="DefaultParagraphFont"/>
+    <w:uiPriority w:val="99"/>
+    <w:semiHidden/>
+    <w:unhideWhenUsed/>
+    <w:rsid w:val="00967C3D"/>
+    <w:rPr>
+      <w:color w:val="96607D" w:themeColor="followedHyperlink"/>
+      <w:u w:val="single"/>
+    </w:rPr>
+  </w:style>
 </w:styles>
 </file>
 

</xml_diff>

<commit_message>
added the detected issues to a text document
</commit_message>
<xml_diff>
--- a/assignment4/report.docx
+++ b/assignment4/report.docx
@@ -38,7 +38,7 @@
       <w:r>
         <w:t xml:space="preserve">Command from </w:t>
       </w:r>
-      <w:hyperlink r:id="rId5" w:history="1">
+      <w:hyperlink r:id="rId6" w:history="1">
         <w:r>
           <w:rPr>
             <w:rStyle w:val="Hyperlink"/>
@@ -54,7 +54,7 @@
       <w:r>
         <w:t xml:space="preserve">Binary release from  </w:t>
       </w:r>
-      <w:hyperlink r:id="rId6" w:history="1">
+      <w:hyperlink r:id="rId7" w:history="1">
         <w:r>
           <w:rPr>
             <w:rStyle w:val="Hyperlink"/>
@@ -117,7 +117,15 @@
     </w:p>
     <w:p>
       <w:r>
-        <w:t xml:space="preserve">java/javac </w:t>
+        <w:t>java/</w:t>
+      </w:r>
+      <w:proofErr w:type="spellStart"/>
+      <w:r>
+        <w:t>javac</w:t>
+      </w:r>
+      <w:proofErr w:type="spellEnd"/>
+      <w:r>
+        <w:t xml:space="preserve"> </w:t>
       </w:r>
       <w:r>
         <w:t>21.0.10</w:t>
@@ -153,13 +161,16 @@
       <w:r>
         <w:t xml:space="preserve"> found </w:t>
       </w:r>
-      <w:proofErr w:type="gramStart"/>
-      <w:r>
-        <w:t>running .</w:t>
-      </w:r>
-      <w:proofErr w:type="gramEnd"/>
-      <w:r>
-        <w:t>/mvnw -version</w:t>
+      <w:r>
+        <w:t>running ./</w:t>
+      </w:r>
+      <w:proofErr w:type="spellStart"/>
+      <w:r>
+        <w:t>mvnw</w:t>
+      </w:r>
+      <w:proofErr w:type="spellEnd"/>
+      <w:r>
+        <w:t xml:space="preserve"> -version</w:t>
       </w:r>
     </w:p>
     <w:p>
@@ -171,7 +182,7 @@
       </w:r>
     </w:p>
     <w:p>
-      <w:hyperlink r:id="rId7" w:history="1">
+      <w:hyperlink r:id="rId8" w:history="1">
         <w:r>
           <w:rPr>
             <w:rStyle w:val="Hyperlink"/>
@@ -183,7 +194,7 @@
       <w:r>
         <w:t xml:space="preserve"> Commit hash </w:t>
       </w:r>
-      <w:hyperlink r:id="rId8" w:history="1">
+      <w:hyperlink r:id="rId9" w:history="1">
         <w:r>
           <w:rPr>
             <w:rStyle w:val="Hyperlink"/>
@@ -214,22 +225,34 @@
         <w:t xml:space="preserve">Using </w:t>
       </w:r>
       <w:r>
-        <w:t>git ls-files | xargs wc -l</w:t>
-      </w:r>
+        <w:t xml:space="preserve">git ls-files | </w:t>
+      </w:r>
+      <w:proofErr w:type="spellStart"/>
+      <w:r>
+        <w:t>xargs</w:t>
+      </w:r>
+      <w:proofErr w:type="spellEnd"/>
       <w:r>
         <w:t xml:space="preserve"> </w:t>
       </w:r>
+      <w:proofErr w:type="spellStart"/>
+      <w:r>
+        <w:t>wc</w:t>
+      </w:r>
+      <w:proofErr w:type="spellEnd"/>
+      <w:r>
+        <w:t xml:space="preserve"> -l</w:t>
+      </w:r>
+      <w:r>
+        <w:t xml:space="preserve"> </w:t>
+      </w:r>
     </w:p>
     <w:p>
       <w:pPr>
         <w:ind w:firstLine="720"/>
       </w:pPr>
       <w:r>
-        <w:t xml:space="preserve">We </w:t>
-      </w:r>
-      <w:proofErr w:type="gramStart"/>
-      <w:r>
-        <w:t xml:space="preserve">find </w:t>
+        <w:t xml:space="preserve">We find </w:t>
       </w:r>
       <w:r>
         <w:t xml:space="preserve"> 135</w:t>
@@ -238,14 +261,21 @@
         <w:t>,</w:t>
       </w:r>
       <w:r>
-        <w:t>018</w:t>
-      </w:r>
-      <w:proofErr w:type="gramEnd"/>
-      <w:r>
-        <w:t xml:space="preserve"> total</w:t>
-      </w:r>
-      <w:r>
-        <w:t xml:space="preserve"> lines of code inside of the vavr repo </w:t>
+        <w:t>018 total</w:t>
+      </w:r>
+      <w:r>
+        <w:t xml:space="preserve"> lines of code inside of the </w:t>
+      </w:r>
+      <w:proofErr w:type="spellStart"/>
+      <w:r>
+        <w:t>vavr</w:t>
+      </w:r>
+      <w:proofErr w:type="spellEnd"/>
+      <w:r>
+        <w:t xml:space="preserve"> repo </w:t>
+      </w:r>
+      <w:r>
+        <w:t>of which 127,257 are pure .java lines found by adding “-name “*.java””</w:t>
       </w:r>
     </w:p>
     <w:p>
@@ -301,16 +331,24 @@
         <w:t xml:space="preserve">. </w:t>
       </w:r>
       <w:r>
-        <w:t>Many fixes were tried, including ensuring environment variables pointed to version 21 of java/javac, forcing the version with “</w:t>
+        <w:t>Many fixes were tried, including ensuring environment variables pointed to version 21 of java/</w:t>
+      </w:r>
+      <w:proofErr w:type="spellStart"/>
+      <w:r>
+        <w:t>javac</w:t>
+      </w:r>
+      <w:proofErr w:type="spellEnd"/>
+      <w:r>
+        <w:t>, forcing the version with “</w:t>
       </w:r>
       <w:r>
         <w:t>-</w:t>
       </w:r>
-      <w:proofErr w:type="gramStart"/>
+      <w:proofErr w:type="spellStart"/>
       <w:r>
         <w:t>Dmaven.compiler.source</w:t>
       </w:r>
-      <w:proofErr w:type="gramEnd"/>
+      <w:proofErr w:type="spellEnd"/>
       <w:r>
         <w:t>=21</w:t>
       </w:r>
@@ -318,7 +356,15 @@
         <w:t>” and “</w:t>
       </w:r>
       <w:r>
-        <w:t>-Djava.version=21</w:t>
+        <w:t>-</w:t>
+      </w:r>
+      <w:proofErr w:type="spellStart"/>
+      <w:r>
+        <w:t>Djava.version</w:t>
+      </w:r>
+      <w:proofErr w:type="spellEnd"/>
+      <w:r>
+        <w:t>=21</w:t>
       </w:r>
       <w:r>
         <w:t xml:space="preserve">” </w:t>
@@ -336,7 +382,15 @@
     <w:p>
       <w:r>
         <w:lastRenderedPageBreak/>
-        <w:t xml:space="preserve">Note that vavr </w:t>
+        <w:t xml:space="preserve">Note that </w:t>
+      </w:r>
+      <w:proofErr w:type="spellStart"/>
+      <w:r>
+        <w:t>vavr</w:t>
+      </w:r>
+      <w:proofErr w:type="spellEnd"/>
+      <w:r>
+        <w:t xml:space="preserve"> </w:t>
       </w:r>
       <w:r>
         <w:t>compiled</w:t>
@@ -367,14 +421,17 @@
       <w:r>
         <w:t xml:space="preserve"> </w:t>
       </w:r>
-      <w:proofErr w:type="gramStart"/>
       <w:r>
         <w:t>“</w:t>
       </w:r>
       <w:r>
-        <w:t>.inferconfig</w:t>
-      </w:r>
-      <w:proofErr w:type="gramEnd"/>
+        <w:t>.</w:t>
+      </w:r>
+      <w:proofErr w:type="spellStart"/>
+      <w:r>
+        <w:t>inferconfig</w:t>
+      </w:r>
+      <w:proofErr w:type="spellEnd"/>
       <w:r>
         <w:t>”</w:t>
       </w:r>
@@ -382,7 +439,15 @@
         <w:t xml:space="preserve"> file</w:t>
       </w:r>
       <w:r>
-        <w:t xml:space="preserve"> to the root /vavr/ dir</w:t>
+        <w:t xml:space="preserve"> to the root /</w:t>
+      </w:r>
+      <w:proofErr w:type="spellStart"/>
+      <w:r>
+        <w:t>vavr</w:t>
+      </w:r>
+      <w:proofErr w:type="spellEnd"/>
+      <w:r>
+        <w:t>/ dir</w:t>
       </w:r>
       <w:r>
         <w:t>ectory</w:t>
@@ -420,21 +485,21 @@
         <w:rPr>
           <w:rFonts w:ascii="Consolas" w:hAnsi="Consolas"/>
         </w:rPr>
-        <w:t xml:space="preserve">infer run </w:t>
-      </w:r>
-      <w:proofErr w:type="gramStart"/>
+        <w:t>infer run -- ./</w:t>
+      </w:r>
+      <w:proofErr w:type="spellStart"/>
       <w:r>
         <w:rPr>
           <w:rFonts w:ascii="Consolas" w:hAnsi="Consolas"/>
         </w:rPr>
-        <w:t>-- .</w:t>
-      </w:r>
-      <w:proofErr w:type="gramEnd"/>
+        <w:t>mvnw</w:t>
+      </w:r>
+      <w:proofErr w:type="spellEnd"/>
       <w:r>
         <w:rPr>
           <w:rFonts w:ascii="Consolas" w:hAnsi="Consolas"/>
         </w:rPr>
-        <w:t>/mvnw clean compile</w:t>
+        <w:t xml:space="preserve"> clean compile</w:t>
       </w:r>
     </w:p>
     <w:p>
@@ -455,7 +520,49 @@
         <w:rPr>
           <w:rFonts w:ascii="Consolas" w:hAnsi="Consolas"/>
         </w:rPr>
-        <w:t>find vavr -name "*.java" | xargs wc -l</w:t>
+        <w:t xml:space="preserve">find </w:t>
+      </w:r>
+      <w:proofErr w:type="spellStart"/>
+      <w:r>
+        <w:rPr>
+          <w:rFonts w:ascii="Consolas" w:hAnsi="Consolas"/>
+        </w:rPr>
+        <w:t>vavr</w:t>
+      </w:r>
+      <w:proofErr w:type="spellEnd"/>
+      <w:r>
+        <w:rPr>
+          <w:rFonts w:ascii="Consolas" w:hAnsi="Consolas"/>
+        </w:rPr>
+        <w:t xml:space="preserve"> -name "*.java" | </w:t>
+      </w:r>
+      <w:proofErr w:type="spellStart"/>
+      <w:r>
+        <w:rPr>
+          <w:rFonts w:ascii="Consolas" w:hAnsi="Consolas"/>
+        </w:rPr>
+        <w:t>xargs</w:t>
+      </w:r>
+      <w:proofErr w:type="spellEnd"/>
+      <w:r>
+        <w:rPr>
+          <w:rFonts w:ascii="Consolas" w:hAnsi="Consolas"/>
+        </w:rPr>
+        <w:t xml:space="preserve"> </w:t>
+      </w:r>
+      <w:proofErr w:type="spellStart"/>
+      <w:r>
+        <w:rPr>
+          <w:rFonts w:ascii="Consolas" w:hAnsi="Consolas"/>
+        </w:rPr>
+        <w:t>wc</w:t>
+      </w:r>
+      <w:proofErr w:type="spellEnd"/>
+      <w:r>
+        <w:rPr>
+          <w:rFonts w:ascii="Consolas" w:hAnsi="Consolas"/>
+        </w:rPr>
+        <w:t xml:space="preserve"> -l</w:t>
       </w:r>
     </w:p>
     <w:p>
@@ -610,9 +717,11 @@
             <w:tcW w:w="988" w:type="dxa"/>
           </w:tcPr>
           <w:p>
+            <w:proofErr w:type="spellStart"/>
             <w:r>
               <w:t>vavr</w:t>
             </w:r>
+            <w:proofErr w:type="spellEnd"/>
           </w:p>
         </w:tc>
         <w:tc>
@@ -750,8 +859,29 @@
       </w:r>
     </w:p>
     <w:p>
-      <w:r>
-        <w:t>vavr/src/main/java/io/vavr/concurrent/FutureImpl.java:2</w:t>
+      <w:proofErr w:type="spellStart"/>
+      <w:r>
+        <w:t>vavr</w:t>
+      </w:r>
+      <w:proofErr w:type="spellEnd"/>
+      <w:r>
+        <w:t>/</w:t>
+      </w:r>
+      <w:proofErr w:type="spellStart"/>
+      <w:r>
+        <w:t>src</w:t>
+      </w:r>
+      <w:proofErr w:type="spellEnd"/>
+      <w:r>
+        <w:t>/main/java/io/</w:t>
+      </w:r>
+      <w:proofErr w:type="spellStart"/>
+      <w:r>
+        <w:t>vavr</w:t>
+      </w:r>
+      <w:proofErr w:type="spellEnd"/>
+      <w:r>
+        <w:t>/concurrent/FutureImpl.java:2</w:t>
       </w:r>
       <w:r>
         <w:t>35</w:t>
@@ -799,7 +929,7 @@
                     <pic:cNvPicPr/>
                   </pic:nvPicPr>
                   <pic:blipFill>
-                    <a:blip r:embed="rId9"/>
+                    <a:blip r:embed="rId10"/>
                     <a:stretch>
                       <a:fillRect/>
                     </a:stretch>
@@ -849,7 +979,7 @@
                     <pic:cNvPicPr/>
                   </pic:nvPicPr>
                   <pic:blipFill>
-                    <a:blip r:embed="rId10"/>
+                    <a:blip r:embed="rId11"/>
                     <a:stretch>
                       <a:fillRect/>
                     </a:stretch>
@@ -1711,7 +1841,7 @@
                     <pic:cNvPicPr/>
                   </pic:nvPicPr>
                   <pic:blipFill>
-                    <a:blip r:embed="rId11"/>
+                    <a:blip r:embed="rId12"/>
                     <a:stretch>
                       <a:fillRect/>
                     </a:stretch>
@@ -1782,8 +1912,13 @@
         <w:t xml:space="preserve"> </w:t>
       </w:r>
       <w:r>
-        <w:t>Experiment 5: Comparison with Semgrep</w:t>
-      </w:r>
+        <w:t xml:space="preserve">Experiment 5: Comparison with </w:t>
+      </w:r>
+      <w:proofErr w:type="spellStart"/>
+      <w:r>
+        <w:t>Semgrep</w:t>
+      </w:r>
+      <w:proofErr w:type="spellEnd"/>
     </w:p>
     <w:p>
       <w:pPr>
@@ -1818,7 +1953,15 @@
         <w:pStyle w:val="Heading4"/>
       </w:pPr>
       <w:r>
-        <w:t>Run Semgrep on the same repository using the default Java ruleset</w:t>
+        <w:t xml:space="preserve">Run </w:t>
+      </w:r>
+      <w:proofErr w:type="spellStart"/>
+      <w:r>
+        <w:t>Semgrep</w:t>
+      </w:r>
+      <w:proofErr w:type="spellEnd"/>
+      <w:r>
+        <w:t xml:space="preserve"> on the same repository using the default Java ruleset</w:t>
       </w:r>
     </w:p>
     <w:p>
@@ -1827,11 +1970,19 @@
           <w:rFonts w:ascii="Consolas" w:hAnsi="Consolas"/>
         </w:rPr>
       </w:pPr>
+      <w:proofErr w:type="spellStart"/>
       <w:r>
         <w:rPr>
           <w:rFonts w:ascii="Consolas" w:hAnsi="Consolas"/>
         </w:rPr>
-        <w:t>semgrep --config=p/java</w:t>
+        <w:t>semgrep</w:t>
+      </w:r>
+      <w:proofErr w:type="spellEnd"/>
+      <w:r>
+        <w:rPr>
+          <w:rFonts w:ascii="Consolas" w:hAnsi="Consolas"/>
+        </w:rPr>
+        <w:t xml:space="preserve"> --config=p/java</w:t>
       </w:r>
     </w:p>
     <w:p>
@@ -1978,9 +2129,11 @@
             <w:tcW w:w="2337" w:type="dxa"/>
           </w:tcPr>
           <w:p>
+            <w:proofErr w:type="spellStart"/>
             <w:r>
               <w:t>Semgrep</w:t>
             </w:r>
+            <w:proofErr w:type="spellEnd"/>
           </w:p>
         </w:tc>
         <w:tc>
@@ -2030,7 +2183,15 @@
         <w:pStyle w:val="Heading4"/>
       </w:pPr>
       <w:r>
-        <w:t>Why might Semgrep detect issues that Infer does not?</w:t>
+        <w:t xml:space="preserve">Why might </w:t>
+      </w:r>
+      <w:proofErr w:type="spellStart"/>
+      <w:r>
+        <w:t>Semgrep</w:t>
+      </w:r>
+      <w:proofErr w:type="spellEnd"/>
+      <w:r>
+        <w:t xml:space="preserve"> detect issues that Infer does not?</w:t>
       </w:r>
     </w:p>
     <w:p/>
@@ -2040,7 +2201,15 @@
       </w:pPr>
       <w:r>
         <w:lastRenderedPageBreak/>
-        <w:t>Why might Infer detect issues that Semgrep does not?</w:t>
+        <w:t xml:space="preserve">Why might Infer detect issues that </w:t>
+      </w:r>
+      <w:proofErr w:type="spellStart"/>
+      <w:r>
+        <w:t>Semgrep</w:t>
+      </w:r>
+      <w:proofErr w:type="spellEnd"/>
+      <w:r>
+        <w:t xml:space="preserve"> does not?</w:t>
       </w:r>
     </w:p>
     <w:p/>
@@ -5913,4 +6082,16 @@
     </a:ext>
   </a:extLst>
 </a:theme>
+</file>
+
+<file path=customXml/item1.xml><?xml version="1.0" encoding="utf-8"?>
+<b:Sources xmlns:b="http://schemas.openxmlformats.org/officeDocument/2006/bibliography" xmlns="http://schemas.openxmlformats.org/officeDocument/2006/bibliography" SelectedStyle="\APASixthEditionOfficeOnline.xsl" StyleName="APA" Version="6"/>
+</file>
+
+<file path=customXml/itemProps1.xml><?xml version="1.0" encoding="utf-8"?>
+<ds:datastoreItem xmlns:ds="http://schemas.openxmlformats.org/officeDocument/2006/customXml" ds:itemID="{814B665E-ECA6-4BAE-872E-2C3F28313293}">
+  <ds:schemaRefs>
+    <ds:schemaRef ds:uri="http://schemas.openxmlformats.org/officeDocument/2006/bibliography"/>
+  </ds:schemaRefs>
+</ds:datastoreItem>
 </file>
</xml_diff>

<commit_message>
finished 6.3 all steps on issue a
</commit_message>
<xml_diff>
--- a/assignment4/report.docx
+++ b/assignment4/report.docx
@@ -5,14 +5,17 @@
     <w:p>
       <w:pPr>
         <w:pStyle w:val="Heading1"/>
-        <w:numPr>
-          <w:ilvl w:val="0"/>
-          <w:numId w:val="3"/>
-        </w:numPr>
+        <w:ind w:left="284"/>
         <w:rPr>
           <w:lang w:val="en-US"/>
         </w:rPr>
       </w:pPr>
+      <w:r>
+        <w:rPr>
+          <w:lang w:val="en-US"/>
+        </w:rPr>
+        <w:t>6.1</w:t>
+      </w:r>
       <w:r>
         <w:rPr>
           <w:lang w:val="en-US"/>
@@ -161,8 +164,13 @@
       <w:r>
         <w:t xml:space="preserve"> found </w:t>
       </w:r>
-      <w:r>
-        <w:t>running ./</w:t>
+      <w:proofErr w:type="gramStart"/>
+      <w:r>
+        <w:t>running .</w:t>
+      </w:r>
+      <w:proofErr w:type="gramEnd"/>
+      <w:r>
+        <w:t>/</w:t>
       </w:r>
       <w:proofErr w:type="spellStart"/>
       <w:r>
@@ -252,7 +260,11 @@
         <w:ind w:firstLine="720"/>
       </w:pPr>
       <w:r>
-        <w:t xml:space="preserve">We find </w:t>
+        <w:t xml:space="preserve">We </w:t>
+      </w:r>
+      <w:proofErr w:type="gramStart"/>
+      <w:r>
+        <w:t xml:space="preserve">find </w:t>
       </w:r>
       <w:r>
         <w:t xml:space="preserve"> 135</w:t>
@@ -261,7 +273,11 @@
         <w:t>,</w:t>
       </w:r>
       <w:r>
-        <w:t>018 total</w:t>
+        <w:t>018</w:t>
+      </w:r>
+      <w:proofErr w:type="gramEnd"/>
+      <w:r>
+        <w:t xml:space="preserve"> total</w:t>
       </w:r>
       <w:r>
         <w:t xml:space="preserve"> lines of code inside of the </w:t>
@@ -300,11 +316,11 @@
     <w:p>
       <w:pPr>
         <w:pStyle w:val="Heading1"/>
-        <w:numPr>
-          <w:ilvl w:val="0"/>
-          <w:numId w:val="3"/>
-        </w:numPr>
-      </w:pPr>
+        <w:ind w:left="644"/>
+      </w:pPr>
+      <w:r>
+        <w:t>6.2</w:t>
+      </w:r>
       <w:r>
         <w:t xml:space="preserve"> </w:t>
       </w:r>
@@ -345,10 +361,12 @@
         <w:t>-</w:t>
       </w:r>
       <w:proofErr w:type="spellStart"/>
+      <w:proofErr w:type="gramStart"/>
       <w:r>
         <w:t>Dmaven.compiler.source</w:t>
       </w:r>
       <w:proofErr w:type="spellEnd"/>
+      <w:proofErr w:type="gramEnd"/>
       <w:r>
         <w:t>=21</w:t>
       </w:r>
@@ -421,6 +439,7 @@
       <w:r>
         <w:t xml:space="preserve"> </w:t>
       </w:r>
+      <w:proofErr w:type="gramStart"/>
       <w:r>
         <w:t>“</w:t>
       </w:r>
@@ -432,6 +451,7 @@
         <w:t>inferconfig</w:t>
       </w:r>
       <w:proofErr w:type="spellEnd"/>
+      <w:proofErr w:type="gramEnd"/>
       <w:r>
         <w:t>”</w:t>
       </w:r>
@@ -485,7 +505,21 @@
         <w:rPr>
           <w:rFonts w:ascii="Consolas" w:hAnsi="Consolas"/>
         </w:rPr>
-        <w:t>infer run -- ./</w:t>
+        <w:t xml:space="preserve">infer run </w:t>
+      </w:r>
+      <w:proofErr w:type="gramStart"/>
+      <w:r>
+        <w:rPr>
+          <w:rFonts w:ascii="Consolas" w:hAnsi="Consolas"/>
+        </w:rPr>
+        <w:t>-- .</w:t>
+      </w:r>
+      <w:proofErr w:type="gramEnd"/>
+      <w:r>
+        <w:rPr>
+          <w:rFonts w:ascii="Consolas" w:hAnsi="Consolas"/>
+        </w:rPr>
+        <w:t>/</w:t>
       </w:r>
       <w:proofErr w:type="spellStart"/>
       <w:r>
@@ -807,11 +841,11 @@
     <w:p>
       <w:pPr>
         <w:pStyle w:val="Heading1"/>
-        <w:numPr>
-          <w:ilvl w:val="0"/>
-          <w:numId w:val="3"/>
-        </w:numPr>
-      </w:pPr>
+        <w:ind w:left="284"/>
+      </w:pPr>
+      <w:r>
+        <w:t>6.3</w:t>
+      </w:r>
       <w:r>
         <w:t xml:space="preserve"> </w:t>
       </w:r>
@@ -859,6 +893,9 @@
       </w:r>
     </w:p>
     <w:p>
+      <w:r>
+        <w:t xml:space="preserve">Source file: </w:t>
+      </w:r>
       <w:proofErr w:type="spellStart"/>
       <w:r>
         <w:t>vavr</w:t>
@@ -889,7 +926,26 @@
     </w:p>
     <w:p>
       <w:r>
-        <w:br w:type="page"/>
+        <w:t xml:space="preserve">Method Name: </w:t>
+      </w:r>
+      <w:r>
+        <w:t xml:space="preserve">public </w:t>
+      </w:r>
+      <w:proofErr w:type="spellStart"/>
+      <w:r>
+        <w:t>boolean</w:t>
+      </w:r>
+      <w:proofErr w:type="spellEnd"/>
+      <w:r>
+        <w:t xml:space="preserve"> </w:t>
+      </w:r>
+      <w:proofErr w:type="gramStart"/>
+      <w:r>
+        <w:t>block(</w:t>
+      </w:r>
+      <w:proofErr w:type="gramEnd"/>
+      <w:r>
+        <w:t>)</w:t>
       </w:r>
     </w:p>
     <w:p>
@@ -897,27 +953,16 @@
         <w:pStyle w:val="Heading4"/>
       </w:pPr>
       <w:r>
-        <w:lastRenderedPageBreak/>
-        <w:t>Relevant code snippet</w:t>
-      </w:r>
-    </w:p>
-    <w:p>
-      <w:pPr>
-        <w:pStyle w:val="Heading4"/>
-      </w:pPr>
-      <w:r>
-        <w:rPr>
-          <w:rFonts w:ascii="Consolas" w:eastAsiaTheme="minorHAnsi" w:hAnsi="Consolas" w:cstheme="minorBidi"/>
-          <w:i w:val="0"/>
-          <w:iCs w:val="0"/>
-          <w:noProof/>
-          <w:color w:val="auto"/>
-        </w:rPr>
+        <w:t>Relevant Code Snippet</w:t>
+      </w:r>
+    </w:p>
+    <w:p>
+      <w:r>
         <w:drawing>
-          <wp:inline distT="0" distB="0" distL="0" distR="0" wp14:anchorId="2B3C57E7" wp14:editId="11BE37C9">
-            <wp:extent cx="2321106" cy="734291"/>
-            <wp:effectExtent l="0" t="0" r="3175" b="8890"/>
-            <wp:docPr id="375992143" name="Picture 1"/>
+          <wp:inline distT="0" distB="0" distL="0" distR="0" wp14:anchorId="6C5D009E" wp14:editId="46ED94A6">
+            <wp:extent cx="5058481" cy="1991003"/>
+            <wp:effectExtent l="0" t="0" r="8890" b="9525"/>
+            <wp:docPr id="1744823614" name="Picture 1"/>
             <wp:cNvGraphicFramePr>
               <a:graphicFrameLocks xmlns:a="http://schemas.openxmlformats.org/drawingml/2006/main" noChangeAspect="1"/>
             </wp:cNvGraphicFramePr>
@@ -925,7 +970,7 @@
               <a:graphicData uri="http://schemas.openxmlformats.org/drawingml/2006/picture">
                 <pic:pic xmlns:pic="http://schemas.openxmlformats.org/drawingml/2006/picture">
                   <pic:nvPicPr>
-                    <pic:cNvPr id="375992143" name=""/>
+                    <pic:cNvPr id="1744823614" name=""/>
                     <pic:cNvPicPr/>
                   </pic:nvPicPr>
                   <pic:blipFill>
@@ -937,7 +982,7 @@
                   <pic:spPr>
                     <a:xfrm>
                       <a:off x="0" y="0"/>
-                      <a:ext cx="2331481" cy="737573"/>
+                      <a:ext cx="5058481" cy="1991003"/>
                     </a:xfrm>
                     <a:prstGeom prst="rect">
                       <a:avLst/>
@@ -955,19 +1000,16 @@
         <w:pStyle w:val="Heading4"/>
       </w:pPr>
       <w:r>
-        <w:t>Screenshot or excerpt of the Infer trace</w:t>
-      </w:r>
-    </w:p>
-    <w:p>
-      <w:r>
-        <w:rPr>
-          <w:noProof/>
-        </w:rPr>
+        <w:t>Screenshot of Infer Trace</w:t>
+      </w:r>
+    </w:p>
+    <w:p>
+      <w:r>
         <w:drawing>
-          <wp:inline distT="0" distB="0" distL="0" distR="0" wp14:anchorId="115C91DA" wp14:editId="0728E678">
-            <wp:extent cx="5943600" cy="1289685"/>
-            <wp:effectExtent l="0" t="0" r="0" b="5715"/>
-            <wp:docPr id="563944669" name="Picture 1"/>
+          <wp:inline distT="0" distB="0" distL="0" distR="0" wp14:anchorId="0D66D856" wp14:editId="51B8D60B">
+            <wp:extent cx="5943600" cy="1085850"/>
+            <wp:effectExtent l="0" t="0" r="0" b="0"/>
+            <wp:docPr id="234861426" name="Picture 1"/>
             <wp:cNvGraphicFramePr>
               <a:graphicFrameLocks xmlns:a="http://schemas.openxmlformats.org/drawingml/2006/main" noChangeAspect="1"/>
             </wp:cNvGraphicFramePr>
@@ -975,7 +1017,7 @@
               <a:graphicData uri="http://schemas.openxmlformats.org/drawingml/2006/picture">
                 <pic:pic xmlns:pic="http://schemas.openxmlformats.org/drawingml/2006/picture">
                   <pic:nvPicPr>
-                    <pic:cNvPr id="563944669" name=""/>
+                    <pic:cNvPr id="234861426" name=""/>
                     <pic:cNvPicPr/>
                   </pic:nvPicPr>
                   <pic:blipFill>
@@ -987,7 +1029,7 @@
                   <pic:spPr>
                     <a:xfrm>
                       <a:off x="0" y="0"/>
-                      <a:ext cx="5943600" cy="1289685"/>
+                      <a:ext cx="5943600" cy="1085850"/>
                     </a:xfrm>
                     <a:prstGeom prst="rect">
                       <a:avLst/>
@@ -1000,64 +1042,37 @@
         </w:drawing>
       </w:r>
     </w:p>
-    <w:p>
-      <w:pPr>
-        <w:pStyle w:val="Heading4"/>
-      </w:pPr>
-      <w:r>
-        <w:t>Execution Path Evidence Table</w:t>
-      </w:r>
-    </w:p>
     <w:tbl>
       <w:tblPr>
         <w:tblStyle w:val="TableGrid"/>
         <w:tblW w:w="0" w:type="auto"/>
+        <w:tblLayout w:type="fixed"/>
         <w:tblLook w:val="04A0" w:firstRow="1" w:lastRow="0" w:firstColumn="1" w:lastColumn="0" w:noHBand="0" w:noVBand="1"/>
       </w:tblPr>
       <w:tblGrid>
-        <w:gridCol w:w="2352"/>
-        <w:gridCol w:w="1842"/>
-        <w:gridCol w:w="707"/>
-        <w:gridCol w:w="4449"/>
+        <w:gridCol w:w="2122"/>
+        <w:gridCol w:w="3118"/>
+        <w:gridCol w:w="709"/>
+        <w:gridCol w:w="3401"/>
       </w:tblGrid>
       <w:tr>
         <w:tc>
           <w:tcPr>
-            <w:tcW w:w="2424" w:type="dxa"/>
+            <w:tcW w:w="2122" w:type="dxa"/>
           </w:tcPr>
           <w:p>
-            <w:pPr>
-              <w:rPr>
-                <w:b/>
-                <w:bCs/>
-              </w:rPr>
-            </w:pPr>
-            <w:r>
-              <w:rPr>
-                <w:b/>
-                <w:bCs/>
-              </w:rPr>
+            <w:r>
               <w:t>Trace Step</w:t>
             </w:r>
           </w:p>
         </w:tc>
         <w:tc>
           <w:tcPr>
-            <w:tcW w:w="1540" w:type="dxa"/>
+            <w:tcW w:w="3118" w:type="dxa"/>
           </w:tcPr>
           <w:p>
-            <w:pPr>
-              <w:rPr>
-                <w:b/>
-                <w:bCs/>
-              </w:rPr>
-            </w:pPr>
-            <w:r>
-              <w:rPr>
-                <w:b/>
-                <w:bCs/>
-              </w:rPr>
-              <w:t xml:space="preserve">File </w:t>
+            <w:r>
+              <w:t>File</w:t>
             </w:r>
           </w:p>
         </w:tc>
@@ -1066,37 +1081,17 @@
             <w:tcW w:w="709" w:type="dxa"/>
           </w:tcPr>
           <w:p>
-            <w:pPr>
-              <w:rPr>
-                <w:b/>
-                <w:bCs/>
-              </w:rPr>
-            </w:pPr>
-            <w:r>
-              <w:rPr>
-                <w:b/>
-                <w:bCs/>
-              </w:rPr>
+            <w:r>
               <w:t>Line</w:t>
             </w:r>
           </w:p>
         </w:tc>
         <w:tc>
           <w:tcPr>
-            <w:tcW w:w="4677" w:type="dxa"/>
+            <w:tcW w:w="3401" w:type="dxa"/>
           </w:tcPr>
           <w:p>
-            <w:pPr>
-              <w:rPr>
-                <w:b/>
-                <w:bCs/>
-              </w:rPr>
-            </w:pPr>
-            <w:r>
-              <w:rPr>
-                <w:b/>
-                <w:bCs/>
-              </w:rPr>
+            <w:r>
               <w:t>Explanation</w:t>
             </w:r>
           </w:p>
@@ -1105,21 +1100,42 @@
       <w:tr>
         <w:tc>
           <w:tcPr>
-            <w:tcW w:w="2424" w:type="dxa"/>
+            <w:tcW w:w="2122" w:type="dxa"/>
           </w:tcPr>
           <w:p>
             <w:r>
-              <w:t>Value introduced</w:t>
+              <w:t xml:space="preserve">Value Introduced </w:t>
             </w:r>
           </w:p>
         </w:tc>
         <w:tc>
           <w:tcPr>
-            <w:tcW w:w="1540" w:type="dxa"/>
+            <w:tcW w:w="3118" w:type="dxa"/>
           </w:tcPr>
           <w:p>
-            <w:r>
-              <w:t>FutureImpl.java</w:t>
+            <w:proofErr w:type="spellStart"/>
+            <w:r>
+              <w:t>vavr</w:t>
+            </w:r>
+            <w:proofErr w:type="spellEnd"/>
+            <w:r>
+              <w:t>/</w:t>
+            </w:r>
+            <w:proofErr w:type="spellStart"/>
+            <w:r>
+              <w:t>src</w:t>
+            </w:r>
+            <w:proofErr w:type="spellEnd"/>
+            <w:r>
+              <w:t>/main/java/io/</w:t>
+            </w:r>
+            <w:proofErr w:type="spellStart"/>
+            <w:r>
+              <w:t>vavr</w:t>
+            </w:r>
+            <w:proofErr w:type="spellEnd"/>
+            <w:r>
+              <w:t>/concurrent/FutureImpl.java</w:t>
             </w:r>
           </w:p>
         </w:tc>
@@ -1135,15 +1151,19 @@
         </w:tc>
         <w:tc>
           <w:tcPr>
-            <w:tcW w:w="4677" w:type="dxa"/>
+            <w:tcW w:w="3401" w:type="dxa"/>
           </w:tcPr>
-          <w:p/>
+          <w:p>
+            <w:r>
+              <w:t>threadEnqueued is initialized to false and becomes mutable state on the anonymous blocker object.</w:t>
+            </w:r>
+          </w:p>
         </w:tc>
       </w:tr>
       <w:tr>
         <w:tc>
           <w:tcPr>
-            <w:tcW w:w="2424" w:type="dxa"/>
+            <w:tcW w:w="2122" w:type="dxa"/>
           </w:tcPr>
           <w:p>
             <w:r>
@@ -1153,11 +1173,32 @@
         </w:tc>
         <w:tc>
           <w:tcPr>
-            <w:tcW w:w="1540" w:type="dxa"/>
+            <w:tcW w:w="3118" w:type="dxa"/>
           </w:tcPr>
           <w:p>
-            <w:r>
-              <w:t>FutureImpl.java</w:t>
+            <w:proofErr w:type="spellStart"/>
+            <w:r>
+              <w:t>vavr</w:t>
+            </w:r>
+            <w:proofErr w:type="spellEnd"/>
+            <w:r>
+              <w:t>/</w:t>
+            </w:r>
+            <w:proofErr w:type="spellStart"/>
+            <w:r>
+              <w:t>src</w:t>
+            </w:r>
+            <w:proofErr w:type="spellEnd"/>
+            <w:r>
+              <w:t>/main/java/io/</w:t>
+            </w:r>
+            <w:proofErr w:type="spellStart"/>
+            <w:r>
+              <w:t>vavr</w:t>
+            </w:r>
+            <w:proofErr w:type="spellEnd"/>
+            <w:r>
+              <w:t>/concurrent/FutureImpl.java</w:t>
             </w:r>
           </w:p>
         </w:tc>
@@ -1167,21 +1208,33 @@
           </w:tcPr>
           <w:p>
             <w:r>
-              <w:t>239</w:t>
+              <w:t>235</w:t>
             </w:r>
           </w:p>
         </w:tc>
         <w:tc>
           <w:tcPr>
-            <w:tcW w:w="4677" w:type="dxa"/>
+            <w:tcW w:w="3401" w:type="dxa"/>
           </w:tcPr>
-          <w:p/>
+          <w:p>
+            <w:r>
+              <w:t xml:space="preserve">The method checks if </w:t>
+            </w:r>
+            <w:proofErr w:type="gramStart"/>
+            <w:r>
+              <w:t>(!threadEnqueued</w:t>
+            </w:r>
+            <w:proofErr w:type="gramEnd"/>
+            <w:r>
+              <w:t>) before enqueueing, so later behavior depends on this unsynchronized access.</w:t>
+            </w:r>
+          </w:p>
         </w:tc>
       </w:tr>
       <w:tr>
         <w:tc>
           <w:tcPr>
-            <w:tcW w:w="2424" w:type="dxa"/>
+            <w:tcW w:w="2122" w:type="dxa"/>
           </w:tcPr>
           <w:p>
             <w:r>
@@ -1191,11 +1244,32 @@
         </w:tc>
         <w:tc>
           <w:tcPr>
-            <w:tcW w:w="1540" w:type="dxa"/>
+            <w:tcW w:w="3118" w:type="dxa"/>
           </w:tcPr>
           <w:p>
-            <w:r>
-              <w:t>FutureImpl.java</w:t>
+            <w:proofErr w:type="spellStart"/>
+            <w:r>
+              <w:t>vavr</w:t>
+            </w:r>
+            <w:proofErr w:type="spellEnd"/>
+            <w:r>
+              <w:t>/</w:t>
+            </w:r>
+            <w:proofErr w:type="spellStart"/>
+            <w:r>
+              <w:t>src</w:t>
+            </w:r>
+            <w:proofErr w:type="spellEnd"/>
+            <w:r>
+              <w:t>/main/java/io/</w:t>
+            </w:r>
+            <w:proofErr w:type="spellStart"/>
+            <w:r>
+              <w:t>vavr</w:t>
+            </w:r>
+            <w:proofErr w:type="spellEnd"/>
+            <w:r>
+              <w:t>/concurrent/FutureImpl.java</w:t>
             </w:r>
           </w:p>
         </w:tc>
@@ -1205,21 +1279,25 @@
           </w:tcPr>
           <w:p>
             <w:r>
-              <w:t>239</w:t>
+              <w:t>242</w:t>
             </w:r>
           </w:p>
         </w:tc>
         <w:tc>
           <w:tcPr>
-            <w:tcW w:w="4677" w:type="dxa"/>
+            <w:tcW w:w="3401" w:type="dxa"/>
           </w:tcPr>
-          <w:p/>
+          <w:p>
+            <w:r>
+              <w:t>The field is written outside synchronization, creating the possible race.</w:t>
+            </w:r>
+          </w:p>
         </w:tc>
       </w:tr>
       <w:tr>
         <w:tc>
           <w:tcPr>
-            <w:tcW w:w="2424" w:type="dxa"/>
+            <w:tcW w:w="2122" w:type="dxa"/>
           </w:tcPr>
           <w:p>
             <w:r>
@@ -1229,70 +1307,137 @@
         </w:tc>
         <w:tc>
           <w:tcPr>
-            <w:tcW w:w="1540" w:type="dxa"/>
+            <w:tcW w:w="3118" w:type="dxa"/>
           </w:tcPr>
-          <w:p/>
+          <w:p>
+            <w:proofErr w:type="spellStart"/>
+            <w:r>
+              <w:t>vavr</w:t>
+            </w:r>
+            <w:proofErr w:type="spellEnd"/>
+            <w:r>
+              <w:t>/</w:t>
+            </w:r>
+            <w:proofErr w:type="spellStart"/>
+            <w:r>
+              <w:t>src</w:t>
+            </w:r>
+            <w:proofErr w:type="spellEnd"/>
+            <w:r>
+              <w:t>/main/java/io/</w:t>
+            </w:r>
+            <w:proofErr w:type="spellStart"/>
+            <w:r>
+              <w:t>vavr</w:t>
+            </w:r>
+            <w:proofErr w:type="spellEnd"/>
+            <w:r>
+              <w:t>/concurrent/FutureImpl.java</w:t>
+            </w:r>
+          </w:p>
         </w:tc>
         <w:tc>
           <w:tcPr>
             <w:tcW w:w="709" w:type="dxa"/>
           </w:tcPr>
-          <w:p/>
+          <w:p>
+            <w:r>
+              <w:t>242</w:t>
+            </w:r>
+          </w:p>
         </w:tc>
         <w:tc>
           <w:tcPr>
-            <w:tcW w:w="4677" w:type="dxa"/>
+            <w:tcW w:w="3401" w:type="dxa"/>
           </w:tcPr>
-          <w:p/>
+          <w:p>
+            <w:r>
+              <w:t>Infer reports the unsynchronized write itself as the violation.</w:t>
+            </w:r>
+          </w:p>
         </w:tc>
       </w:tr>
     </w:tbl>
-    <w:p>
-      <w:pPr>
+    <w:p/>
+    <w:p>
+      <w:r>
+        <w:br w:type="page"/>
+      </w:r>
+    </w:p>
+    <w:p>
+      <w:pPr>
+        <w:pStyle w:val="Heading4"/>
+      </w:pPr>
+      <w:r>
+        <w:lastRenderedPageBreak/>
+        <w:t>T1. First Feasible Failure Point</w:t>
+      </w:r>
+    </w:p>
+    <w:p>
+      <w:r>
+        <w:t xml:space="preserve">File &amp; Line Number – </w:t>
+      </w:r>
+      <w:r>
         <w:rPr>
           <w:b/>
           <w:bCs/>
         </w:rPr>
-      </w:pPr>
-    </w:p>
-    <w:p>
-      <w:pPr>
-        <w:pStyle w:val="Heading4"/>
-      </w:pPr>
-      <w:r>
-        <w:t>T1. First Feasible Failure Point</w:t>
-      </w:r>
-    </w:p>
-    <w:p>
-      <w:pPr>
+        <w:t>FutureImpl.java:221</w:t>
+      </w:r>
+    </w:p>
+    <w:p>
+      <w:r>
         <w:rPr>
           <w:b/>
           <w:bCs/>
         </w:rPr>
-      </w:pPr>
+        <w:tab/>
+      </w:r>
+      <w:r>
+        <w:t xml:space="preserve">The reason why this is the </w:t>
+      </w:r>
+      <w:r>
+        <w:t xml:space="preserve">first risky state is we introduce threadEnqueued as a shared mutable state on the anonymous ManagedBlocker object. After the introduction of that state accesses to that variable can become a race if the same blocker instance is </w:t>
+      </w:r>
+      <w:r>
+        <w:t>accessed by</w:t>
+      </w:r>
+      <w:r>
+        <w:t xml:space="preserve"> multiple threads. </w:t>
+      </w:r>
+    </w:p>
+    <w:p>
+      <w:r>
+        <w:tab/>
+        <w:t xml:space="preserve">Infer both the read on line 235 and write at line 242, but the condition for both warnings is the existence and handling of this shared mutable state. </w:t>
+      </w:r>
     </w:p>
     <w:p>
       <w:pPr>
         <w:pStyle w:val="Heading4"/>
       </w:pPr>
+    </w:p>
+    <w:p>
+      <w:pPr>
+        <w:pStyle w:val="Heading4"/>
+      </w:pPr>
       <w:r>
         <w:t>T2. Infer Assumption</w:t>
       </w:r>
     </w:p>
     <w:p>
-      <w:pPr>
+      <w:r>
+        <w:t xml:space="preserve">The assumption Infer makes is that </w:t>
+      </w:r>
+      <w:r>
         <w:rPr>
           <w:b/>
           <w:bCs/>
         </w:rPr>
-      </w:pPr>
-    </w:p>
-    <w:p>
-      <w:pPr>
-        <w:pStyle w:val="Heading4"/>
-      </w:pPr>
-      <w:r>
-        <w:t>T3. Refactoring Robustness</w:t>
+        <w:t>the ForkJoinPool.ManagedBlocker instance may be accessed by more than one thread</w:t>
+      </w:r>
+      <w:r>
+        <w:t xml:space="preserve">, so block() could execute on the same object concurrently in multiple threads. Because block is a method on an object and Infer cannot prove the object is confined on one thread is assumes another thread could call that block. With that assumption the read on line 235 and write on line 242 form a possible race. </w:t>
       </w:r>
     </w:p>
     <w:p>
@@ -1308,23 +1453,202 @@
         <w:pStyle w:val="Heading4"/>
       </w:pPr>
       <w:r>
+        <w:t>T3. Refactoring Robustness</w:t>
+      </w:r>
+    </w:p>
+    <w:p>
+      <w:r>
+        <w:t xml:space="preserve">Unlikely Semgrep would detect the issue in its current state, and it would make no difference if we refactored it unless we wrote a custom rule for this access pattern. </w:t>
+      </w:r>
+      <w:r>
+        <w:rPr>
+          <w:b/>
+          <w:bCs/>
+        </w:rPr>
+        <w:t>Semgrep</w:t>
+      </w:r>
+      <w:r>
+        <w:t xml:space="preserve"> is primarily pattern-based so a small refactor such as renaming or extracting </w:t>
+      </w:r>
+      <w:r>
+        <w:rPr>
+          <w:b/>
+          <w:bCs/>
+        </w:rPr>
+        <w:t>could break</w:t>
+      </w:r>
+      <w:r>
+        <w:t xml:space="preserve"> any simple rule we would write for this unless it is very well made.</w:t>
+      </w:r>
+    </w:p>
+    <w:p>
+      <w:pPr>
+        <w:rPr>
+          <w:b/>
+          <w:bCs/>
+        </w:rPr>
+      </w:pPr>
+      <w:r>
+        <w:t xml:space="preserve">Unlike Semgrep Infer is path sensitive and focuses on program behaviour most forms of refactoring like rename or extraction would not change the fact that the same read and write are done without proper guarding or synchronization, so </w:t>
+      </w:r>
+      <w:r>
+        <w:rPr>
+          <w:b/>
+          <w:bCs/>
+        </w:rPr>
+        <w:t>Infer would probably still report it.</w:t>
+      </w:r>
+    </w:p>
+    <w:p>
+      <w:pPr>
+        <w:rPr>
+          <w:b/>
+          <w:bCs/>
+        </w:rPr>
+      </w:pPr>
+    </w:p>
+    <w:p>
+      <w:pPr>
+        <w:pStyle w:val="Heading4"/>
+      </w:pPr>
+      <w:r>
         <w:t>Classification</w:t>
       </w:r>
     </w:p>
-    <w:p/>
-    <w:p>
-      <w:pPr>
-        <w:pStyle w:val="Heading4"/>
-      </w:pPr>
-      <w:r>
-        <w:t>Fix Validation</w:t>
-      </w:r>
-      <w:r>
-        <w:t xml:space="preserve"> (Issue A only)</w:t>
+    <w:p>
+      <w:r>
+        <w:rPr>
+          <w:b/>
+          <w:bCs/>
+        </w:rPr>
+        <w:t>Likely a false positive.</w:t>
+      </w:r>
+      <w:r>
+        <w:rPr>
+          <w:b/>
+          <w:bCs/>
+        </w:rPr>
+        <w:t xml:space="preserve"> </w:t>
+      </w:r>
+      <w:r>
+        <w:t xml:space="preserve">The variable belongs to a fresh anonymous managed blocker </w:t>
+      </w:r>
+      <w:r>
+        <w:t>instance</w:t>
+      </w:r>
+      <w:r>
+        <w:t xml:space="preserve"> created inside an _await() invocation and appears to only be used only by the current waiting thread. Since the object does not appear to be shared, the race is likely infeasible in practice.</w:t>
       </w:r>
     </w:p>
     <w:p/>
     <w:p/>
+    <w:p>
+      <w:pPr>
+        <w:pStyle w:val="Heading4"/>
+      </w:pPr>
+      <w:r>
+        <w:t>Fix Validation</w:t>
+      </w:r>
+      <w:r>
+        <w:t xml:space="preserve"> (Issue A only)</w:t>
+      </w:r>
+    </w:p>
+    <w:p>
+      <w:r>
+        <w:t xml:space="preserve">An </w:t>
+      </w:r>
+      <w:proofErr w:type="gramStart"/>
+      <w:r>
+        <w:t>Idea</w:t>
+      </w:r>
+      <w:proofErr w:type="gramEnd"/>
+      <w:r>
+        <w:t xml:space="preserve"> to make infer not freak out over this is to protect threadEnqueued with the same lock on both the read and write.</w:t>
+      </w:r>
+    </w:p>
+    <w:p>
+      <w:r>
+        <w:drawing>
+          <wp:inline distT="0" distB="0" distL="0" distR="0" wp14:anchorId="50684C59" wp14:editId="4C45E220">
+            <wp:extent cx="4515480" cy="2057687"/>
+            <wp:effectExtent l="0" t="0" r="0" b="0"/>
+            <wp:docPr id="65926409" name="Picture 1"/>
+            <wp:cNvGraphicFramePr>
+              <a:graphicFrameLocks xmlns:a="http://schemas.openxmlformats.org/drawingml/2006/main" noChangeAspect="1"/>
+            </wp:cNvGraphicFramePr>
+            <a:graphic xmlns:a="http://schemas.openxmlformats.org/drawingml/2006/main">
+              <a:graphicData uri="http://schemas.openxmlformats.org/drawingml/2006/picture">
+                <pic:pic xmlns:pic="http://schemas.openxmlformats.org/drawingml/2006/picture">
+                  <pic:nvPicPr>
+                    <pic:cNvPr id="65926409" name=""/>
+                    <pic:cNvPicPr/>
+                  </pic:nvPicPr>
+                  <pic:blipFill>
+                    <a:blip r:embed="rId12"/>
+                    <a:stretch>
+                      <a:fillRect/>
+                    </a:stretch>
+                  </pic:blipFill>
+                  <pic:spPr>
+                    <a:xfrm>
+                      <a:off x="0" y="0"/>
+                      <a:ext cx="4515480" cy="2057687"/>
+                    </a:xfrm>
+                    <a:prstGeom prst="rect">
+                      <a:avLst/>
+                    </a:prstGeom>
+                  </pic:spPr>
+                </pic:pic>
+              </a:graphicData>
+            </a:graphic>
+          </wp:inline>
+        </w:drawing>
+      </w:r>
+    </w:p>
+    <w:p>
+      <w:r>
+        <w:t>Running the tool again we find the issue is eliminated</w:t>
+      </w:r>
+    </w:p>
+    <w:p>
+      <w:r>
+        <w:drawing>
+          <wp:inline distT="0" distB="0" distL="0" distR="0" wp14:anchorId="344B97F0" wp14:editId="07DB22C0">
+            <wp:extent cx="5943600" cy="535305"/>
+            <wp:effectExtent l="0" t="0" r="0" b="0"/>
+            <wp:docPr id="330251707" name="Picture 1"/>
+            <wp:cNvGraphicFramePr>
+              <a:graphicFrameLocks xmlns:a="http://schemas.openxmlformats.org/drawingml/2006/main" noChangeAspect="1"/>
+            </wp:cNvGraphicFramePr>
+            <a:graphic xmlns:a="http://schemas.openxmlformats.org/drawingml/2006/main">
+              <a:graphicData uri="http://schemas.openxmlformats.org/drawingml/2006/picture">
+                <pic:pic xmlns:pic="http://schemas.openxmlformats.org/drawingml/2006/picture">
+                  <pic:nvPicPr>
+                    <pic:cNvPr id="330251707" name=""/>
+                    <pic:cNvPicPr/>
+                  </pic:nvPicPr>
+                  <pic:blipFill>
+                    <a:blip r:embed="rId13"/>
+                    <a:stretch>
+                      <a:fillRect/>
+                    </a:stretch>
+                  </pic:blipFill>
+                  <pic:spPr>
+                    <a:xfrm>
+                      <a:off x="0" y="0"/>
+                      <a:ext cx="5943600" cy="535305"/>
+                    </a:xfrm>
+                    <a:prstGeom prst="rect">
+                      <a:avLst/>
+                    </a:prstGeom>
+                  </pic:spPr>
+                </pic:pic>
+              </a:graphicData>
+            </a:graphic>
+          </wp:inline>
+        </w:drawing>
+      </w:r>
+    </w:p>
     <w:p>
       <w:pPr>
         <w:pStyle w:val="Heading2"/>
@@ -1366,7 +1690,6 @@
         </w:numPr>
       </w:pPr>
       <w:r>
-        <w:lastRenderedPageBreak/>
         <w:t>Relevant code snippet</w:t>
       </w:r>
     </w:p>
@@ -1734,6 +2057,7 @@
         <w:pStyle w:val="Heading4"/>
       </w:pPr>
       <w:r>
+        <w:lastRenderedPageBreak/>
         <w:t>T3. Refactoring Robustness</w:t>
       </w:r>
     </w:p>
@@ -1760,30 +2084,23 @@
           <w:bCs/>
         </w:rPr>
       </w:pPr>
-      <w:r>
+    </w:p>
+    <w:p>
+      <w:pPr>
         <w:rPr>
           <w:b/>
           <w:bCs/>
         </w:rPr>
-        <w:br w:type="page"/>
-      </w:r>
-    </w:p>
-    <w:p>
-      <w:pPr>
-        <w:rPr>
-          <w:b/>
-          <w:bCs/>
-        </w:rPr>
       </w:pPr>
     </w:p>
     <w:p>
       <w:pPr>
         <w:pStyle w:val="Heading1"/>
-        <w:numPr>
-          <w:ilvl w:val="0"/>
-          <w:numId w:val="3"/>
-        </w:numPr>
-      </w:pPr>
+        <w:ind w:left="284"/>
+      </w:pPr>
+      <w:r>
+        <w:t>6.4</w:t>
+      </w:r>
       <w:r>
         <w:t xml:space="preserve"> </w:t>
       </w:r>
@@ -1841,7 +2158,7 @@
                     <pic:cNvPicPr/>
                   </pic:nvPicPr>
                   <pic:blipFill>
-                    <a:blip r:embed="rId12"/>
+                    <a:blip r:embed="rId14"/>
                     <a:stretch>
                       <a:fillRect/>
                     </a:stretch>
@@ -1912,13 +2229,8 @@
         <w:t xml:space="preserve"> </w:t>
       </w:r>
       <w:r>
-        <w:t xml:space="preserve">Experiment 5: Comparison with </w:t>
-      </w:r>
-      <w:proofErr w:type="spellStart"/>
-      <w:r>
-        <w:t>Semgrep</w:t>
-      </w:r>
-      <w:proofErr w:type="spellEnd"/>
+        <w:t>Experiment 5: Comparison with Semgrep</w:t>
+      </w:r>
     </w:p>
     <w:p>
       <w:pPr>
@@ -1953,15 +2265,7 @@
         <w:pStyle w:val="Heading4"/>
       </w:pPr>
       <w:r>
-        <w:t xml:space="preserve">Run </w:t>
-      </w:r>
-      <w:proofErr w:type="spellStart"/>
-      <w:r>
-        <w:t>Semgrep</w:t>
-      </w:r>
-      <w:proofErr w:type="spellEnd"/>
-      <w:r>
-        <w:t xml:space="preserve"> on the same repository using the default Java ruleset</w:t>
+        <w:t>Run Semgrep on the same repository using the default Java ruleset</w:t>
       </w:r>
     </w:p>
     <w:p>
@@ -2129,11 +2433,9 @@
             <w:tcW w:w="2337" w:type="dxa"/>
           </w:tcPr>
           <w:p>
-            <w:proofErr w:type="spellStart"/>
             <w:r>
               <w:t>Semgrep</w:t>
             </w:r>
-            <w:proofErr w:type="spellEnd"/>
           </w:p>
         </w:tc>
         <w:tc>
@@ -2174,6 +2476,7 @@
         <w:pStyle w:val="Heading4"/>
       </w:pPr>
       <w:r>
+        <w:lastRenderedPageBreak/>
         <w:t>Did both tools report issues in the same files or methods?</w:t>
       </w:r>
     </w:p>
@@ -2183,15 +2486,7 @@
         <w:pStyle w:val="Heading4"/>
       </w:pPr>
       <w:r>
-        <w:t xml:space="preserve">Why might </w:t>
-      </w:r>
-      <w:proofErr w:type="spellStart"/>
-      <w:r>
-        <w:t>Semgrep</w:t>
-      </w:r>
-      <w:proofErr w:type="spellEnd"/>
-      <w:r>
-        <w:t xml:space="preserve"> detect issues that Infer does not?</w:t>
+        <w:t>Why might Semgrep detect issues that Infer does not?</w:t>
       </w:r>
     </w:p>
     <w:p/>
@@ -2200,16 +2495,7 @@
         <w:pStyle w:val="Heading4"/>
       </w:pPr>
       <w:r>
-        <w:lastRenderedPageBreak/>
-        <w:t xml:space="preserve">Why might Infer detect issues that </w:t>
-      </w:r>
-      <w:proofErr w:type="spellStart"/>
-      <w:r>
-        <w:t>Semgrep</w:t>
-      </w:r>
-      <w:proofErr w:type="spellEnd"/>
-      <w:r>
-        <w:t xml:space="preserve"> does not?</w:t>
+        <w:t>Why might Infer detect issues that Semgrep does not?</w:t>
       </w:r>
     </w:p>
     <w:p/>
@@ -3682,7 +3968,7 @@
       <w:lvlText w:val="%1."/>
       <w:lvlJc w:val="left"/>
       <w:pPr>
-        <w:ind w:left="720" w:hanging="360"/>
+        <w:ind w:left="644" w:hanging="360"/>
       </w:pPr>
       <w:rPr>
         <w:rFonts w:hint="default"/>
@@ -3694,7 +3980,7 @@
       <w:lvlText w:val="%2."/>
       <w:lvlJc w:val="left"/>
       <w:pPr>
-        <w:ind w:left="1440" w:hanging="360"/>
+        <w:ind w:left="1364" w:hanging="360"/>
       </w:pPr>
     </w:lvl>
     <w:lvl w:ilvl="2" w:tplc="1009001B" w:tentative="1">
@@ -3703,7 +3989,7 @@
       <w:lvlText w:val="%3."/>
       <w:lvlJc w:val="right"/>
       <w:pPr>
-        <w:ind w:left="2160" w:hanging="180"/>
+        <w:ind w:left="2084" w:hanging="180"/>
       </w:pPr>
     </w:lvl>
     <w:lvl w:ilvl="3" w:tplc="1009000F" w:tentative="1">
@@ -3712,7 +3998,7 @@
       <w:lvlText w:val="%4."/>
       <w:lvlJc w:val="left"/>
       <w:pPr>
-        <w:ind w:left="2880" w:hanging="360"/>
+        <w:ind w:left="2804" w:hanging="360"/>
       </w:pPr>
     </w:lvl>
     <w:lvl w:ilvl="4" w:tplc="10090019" w:tentative="1">
@@ -3721,7 +4007,7 @@
       <w:lvlText w:val="%5."/>
       <w:lvlJc w:val="left"/>
       <w:pPr>
-        <w:ind w:left="3600" w:hanging="360"/>
+        <w:ind w:left="3524" w:hanging="360"/>
       </w:pPr>
     </w:lvl>
     <w:lvl w:ilvl="5" w:tplc="1009001B" w:tentative="1">
@@ -3730,7 +4016,7 @@
       <w:lvlText w:val="%6."/>
       <w:lvlJc w:val="right"/>
       <w:pPr>
-        <w:ind w:left="4320" w:hanging="180"/>
+        <w:ind w:left="4244" w:hanging="180"/>
       </w:pPr>
     </w:lvl>
     <w:lvl w:ilvl="6" w:tplc="1009000F" w:tentative="1">
@@ -3739,7 +4025,7 @@
       <w:lvlText w:val="%7."/>
       <w:lvlJc w:val="left"/>
       <w:pPr>
-        <w:ind w:left="5040" w:hanging="360"/>
+        <w:ind w:left="4964" w:hanging="360"/>
       </w:pPr>
     </w:lvl>
     <w:lvl w:ilvl="7" w:tplc="10090019" w:tentative="1">
@@ -3748,7 +4034,7 @@
       <w:lvlText w:val="%8."/>
       <w:lvlJc w:val="left"/>
       <w:pPr>
-        <w:ind w:left="5760" w:hanging="360"/>
+        <w:ind w:left="5684" w:hanging="360"/>
       </w:pPr>
     </w:lvl>
     <w:lvl w:ilvl="8" w:tplc="1009001B" w:tentative="1">
@@ -3757,7 +4043,7 @@
       <w:lvlText w:val="%9."/>
       <w:lvlJc w:val="right"/>
       <w:pPr>
-        <w:ind w:left="6480" w:hanging="180"/>
+        <w:ind w:left="6404" w:hanging="180"/>
       </w:pPr>
     </w:lvl>
   </w:abstractNum>

</xml_diff>